<commit_message>
Chaitanya-chandramrita: restored Sanskrit, IAST, word-for-word, verified translation (53 fixes), full edition
Co-Authored-By: Claude Opus 5.5 <noreply@anthropic.com>
Claude-Session: https://claude.ai/code/session_01KGC2T1PiSRGJe48WTtGST9
</commit_message>
<xml_diff>
--- a/chaitanya-chandramrita/Chaitanya-Chandramrita-ru.docx
+++ b/chaitanya-chandramrita/Chaitanya-Chandramrita-ru.docx
@@ -170,7 +170,47 @@
         <w:br/>
       </w:r>
       <w:r>
-        <w:t>источником не служил. Места, где текст восстановлен неполно, оговорены в примечаниях.</w:t>
+        <w:t>источником не служил.</w:t>
+      </w:r>
+    </w:p>
+    <w:p>
+      <w:pPr>
+        <w:spacing w:after="60"/>
+        <w:jc w:val="both"/>
+      </w:pPr>
+      <w:r>
+        <w:rPr>
+          <w:b/>
+          <w:i w:val="0"/>
+        </w:rPr>
+        <w:t>Сверка.</w:t>
+      </w:r>
+      <w:r>
+        <w:t xml:space="preserve"> После первого перевода санскритский текст был построчно восстановлен по обоим изданиям</w:t>
+      </w:r>
+      <w:r>
+        <w:br/>
+      </w:r>
+      <w:r>
+        <w:t>(с проверкой метра и опорой на пословный разбор Бхактисиддханты), и перевод каждой шлоки заново</w:t>
+      </w:r>
+      <w:r>
+        <w:br/>
+      </w:r>
+      <w:r>
+        <w:t>сверен с ним. Из 143 шлок (включая шлоку в скобках) 90 оказались переведены верно, в 38 внесены</w:t>
+      </w:r>
+      <w:r>
+        <w:br/>
+      </w:r>
+      <w:r>
+        <w:t>мелкие уточнения, в 15 исправлены смысловые ошибки, возникшие в основном из-за испорченного OCR.</w:t>
+      </w:r>
+      <w:r>
+        <w:br/>
+      </w:r>
+      <w:r>
+        <w:t>Восстановленный санскритский текст с транслитерацией и пословным переводом дан в полной версии.</w:t>
       </w:r>
     </w:p>
     <w:p>
@@ -265,7 +305,7 @@
         <w:t>1.</w:t>
       </w:r>
       <w:r>
-        <w:t xml:space="preserve"> Славим того, кто имеет облик Чайтаньи, — лучшего, сына владыки Враджа, чья щедрость безмерна и высшим образом удивительна; того, кто явился в высшей обители Навадвипе, чтобы самому вкусить и раздать другим нектарные волны своей чистой, сводящей с ума, сладкой любви.</w:t>
+        <w:t xml:space="preserve"> Славим лучшего из всех — того, кто имеет облик Чайтаньи, чья щедрость безмерна и высшим образом удивительна; того, кто явился в высшей обители Навадвипе, чтобы дать вкусить сыну владыки Враджа — самому себе — нектарные волны своей чистой, сводящей с ума, сладкой любви и раздать их другим.</w:t>
       </w:r>
     </w:p>
     <w:p>
@@ -345,7 +385,7 @@
         <w:t>6.</w:t>
       </w:r>
       <w:r>
-        <w:t xml:space="preserve"> Его преданные, которым поклоняются и боги, испив дивный нектарный сок сияющей любви и блаженства, что струится с его лотосных стоп, смеются над Брахмой и другими, не очень-то почитают даже великих вайшнавов и порицают знатоков Брахмана и йоги. Славим этого Гаурачандру.</w:t>
+        <w:t xml:space="preserve"> Его преданные, которым поклоняются и боги, испив и опьянившись дивным нектарным соком сияющей любви и блаженства, что струится с его лотосных стоп, смеются над Брахмой и другими, не очень-то почитают даже великих вайшнавов и порицают знатоков Брахмана и йоги. Славим этого Гаурачандру.</w:t>
       </w:r>
     </w:p>
     <w:p>
@@ -417,7 +457,7 @@
         <w:t>10.</w:t>
       </w:r>
       <w:r>
-        <w:t xml:space="preserve"> Он громко хлопает в ладоши и топает ногами — о чудо! — вскинув руки, подобные золотым столпам; его тело колышется в прекрасном танце, очи — продолговаты, как лотосы; восклицаниями «Хари! Хари!», полными безумного блаженства, он уничтожает всё неблагое во вселенной. Поклоняюсь этому Чайтанье-Луне, венцу богов, охваченному несравненной расой.</w:t>
+        <w:t xml:space="preserve"> Он сильно размахивает руками и ногами — о чудо! — вскинув руки, подобные золотым столпам; его тело колышется в прекрасном танце, очи — продолговаты, как лотосы; неописуемыми восклицаниями «Хари! Хари!», полными безумного блаженства, он уничтожает всё неблагое во вселенной. Поклоняюсь этому Чайтанье-Луне, венцу богов, охваченному несравненной расой.</w:t>
       </w:r>
     </w:p>
     <w:p>
@@ -597,7 +637,7 @@
         <w:t>18.</w:t>
       </w:r>
       <w:r>
-        <w:t xml:space="preserve"> Где некогда утомились даже владыки мудрецов, куда на всей земле не проникла ничья мысль, чего не знал и Шука, чего милостивый Шаури (Кришна) нигде не открыл даже своим близким, — по этому сияющему пути бхакти радостно играют любимцы Гауры.</w:t>
+        <w:t xml:space="preserve"> На этом пути, где некогда блуждали даже владыки мудрецов, куда на всей земле не проникла ничья мысль, которого не знал и Шука, которого милостивый Шаури (Кришна) нигде не открыл даже своим близким, — на этом сияющем пути бхакти радостно играют любимцы Гауры.</w:t>
       </w:r>
     </w:p>
     <w:p>
@@ -629,7 +669,7 @@
         <w:t>20.</w:t>
       </w:r>
       <w:r>
-        <w:t xml:space="preserve"> Где ещё такое отречение, где такое отвращение к разговорам о чувственных предметах, словно к аду, где эта волна, переполненная смирением, где та сила, где тот путь бхакти, — какое можно было бы найти у тех, чья цель — Гаура?</w:t>
+        <w:t xml:space="preserve"> Где ещё такое отречение, где такое отвращение к разговорам о чувственных предметах, словно к аду, где эта волна, переполненная смирением, где та неземная сила, где тот путь великой бхакти, — всё, что видишь у тех, чьё прибежище — Гаура?</w:t>
       </w:r>
     </w:p>
     <w:p>
@@ -757,7 +797,7 @@
         <w:t>28.</w:t>
       </w:r>
       <w:r>
-        <w:t xml:space="preserve"> Всё, что когда-либо было, будет или есть в этом мире — любой, даже самой малой, связи с расой лотосных стоп Господа, — всё это, я знаю, от разлившейся милости этого Гауры, играющего высшим богатством — преданностью себе. Поэтому [его преданные] свободны от зависти.</w:t>
+        <w:t xml:space="preserve"> Такой связи с расой лотосных стоп Господа, какой ни у кого в этом мире не было, не будет и нет, — всё это познают свободные от зависти благодаря разлившейся милости этого Гауры, играющего высшим богатством — преданностью себе.</w:t>
       </w:r>
     </w:p>
     <w:p>
@@ -896,7 +936,7 @@
         <w:t>29.</w:t>
       </w:r>
       <w:r>
-        <w:t xml:space="preserve"> О, какое великое счастье проявило себя здесь, сделав видимым глазу сына Шачи — венец всего множества Вед! Он изгоняет гордыню владык богов и мудрецов, которые мнят себя великими и не знают его лотосных стоп.</w:t>
+        <w:t xml:space="preserve"> О, какое великое счастье проявило себя здесь, сделав видимым глазу сына Шачи — того, кого ищут венцы всего множества Вед! Он изгоняет гордыню владык богов и мудрецов, которые мнят себя великими и не знают его лотосных стоп.</w:t>
       </w:r>
     </w:p>
     <w:p>
@@ -944,7 +984,7 @@
         <w:t>32.</w:t>
       </w:r>
       <w:r>
-        <w:t xml:space="preserve"> Позор тупицам, расцветающим от слов «я — Брахман»! Позор, позор привязанным к обрядам, суровым подвижникам и аскетам-йогам! Да и стоит ли нам горевать о двуногих животных, опьянённых вкусом чувственных удовольствий? Увы, никому из них не досталось и капли мёда Гауры.</w:t>
+        <w:t xml:space="preserve"> Позор, позор привязанным к обрядам, позор суровым подвижникам и аскетам-йогам! Позор тупицам, чьи лица расцветают от слов «я — Брахман»! Да и стоит ли нам горевать о двуногих животных, опьянённых вкусом чувственных удовольствий? Увы, никому из них не досталось и капли мёда Гауры.</w:t>
       </w:r>
     </w:p>
     <w:p>
@@ -976,7 +1016,7 @@
         <w:t>34.</w:t>
       </w:r>
       <w:r>
-        <w:t xml:space="preserve"> Когда снизошёл Гаурачандра и разлился океан любви, полный ярко сияющих самоцветов, — кто беден, тот беден лишь по своей вине.</w:t>
+        <w:t xml:space="preserve"> Когда снизошёл Гаурачандра и разлился океан любви, полный ярко сияющих самоцветов, — кто остался бедным, тот поистине бедняк.</w:t>
       </w:r>
     </w:p>
     <w:p>
@@ -1008,7 +1048,7 @@
         <w:t>36.</w:t>
       </w:r>
       <w:r>
-        <w:t xml:space="preserve"> Когда явилась Чайтанья-Луна и простёрся океан нектарной расы великой любви, — кто беден, тот беден лишь по своей вине.</w:t>
+        <w:t xml:space="preserve"> Когда явилась Чайтанья-Луна и простёрся океан нектарной расы великой любви, — кто остался бедным, тот поистине бедняк.</w:t>
       </w:r>
     </w:p>
     <w:p>
@@ -1024,7 +1064,7 @@
         <w:t>37.</w:t>
       </w:r>
       <w:r>
-        <w:t xml:space="preserve"> Если люди не знают, что Чайтанья — Бог, то этот мир для них лишён сознания (а-чайтанья). Пусть они знают все шастры — они лишь блуждают.</w:t>
+        <w:t xml:space="preserve"> Если люди, даже знающие все шастры, не знают, что Чайтанья — Бог, они лишь блуждают по этому миру, лишённому сознания (а-чайтанья).</w:t>
       </w:r>
     </w:p>
     <w:p>
@@ -1072,7 +1112,7 @@
         <w:t>40.</w:t>
       </w:r>
       <w:r>
-        <w:t xml:space="preserve"> Кто не признаёт Гауру, видя неземное раскрытие игр опьяняющей расы любви, видя его спутников, сподвижников и деяния, и даже тогда, когда тот насильно дарует праздник великой, дивной любви, — тот здесь глупец, двуногое животное.</w:t>
+        <w:t xml:space="preserve"> Кто не обращает ума к самому Гауре, который неземным раскрытием игр опьяняющей расы любви внезапно дарует праздник великой, дивной любви даже тому, кто не принадлежит к числу этих благочестивых спутников и сподвижников Шри Говинды, — тот здесь величайший глупец, двуногое животное.</w:t>
       </w:r>
     </w:p>
     <w:p>
@@ -1088,7 +1128,7 @@
         <w:t>41.</w:t>
       </w:r>
       <w:r>
-        <w:t xml:space="preserve"> Бесчисленные воплощения Господа названы в шрути и других писаниях — но кто, кроме Всевышнего, мог бы явить такое могущество? Да и что говорить: сколько, сколько было у святых опытов, даже во сне! И всё же, увы, Хари, Хари, глупцы не признают Хари в Шри Гауре.</w:t>
+        <w:t xml:space="preserve"> Бесчисленные воплощения Господа названы в шрути и других писаниях — но кто мог бы приписать такое могущество кому-либо, кроме Всевышнего? Да и что говорить: сколько, сколько откровений было у святых об их возлюбленном Гауре! И всё же, увы, Хари, Хари, глупцы не признают Хари в Шри Гауре.</w:t>
       </w:r>
     </w:p>
     <w:p>
@@ -1104,7 +1144,306 @@
         <w:t>42.</w:t>
       </w:r>
       <w:r>
-        <w:t xml:space="preserve"> Его игривый взгляд разнообразными преображениями делает ничтожными для всех воплощённых даже освобождение и прочие цели и рождает в них блаженство любви</w:t>
+        <w:t xml:space="preserve"> Его игривый взгляд рождает во всех воплощённых блаженство любви, которое разнообразными преображениями показывает ничтожность даже освобождения и прочих целей. Если этот Гаурачандра, сокрытый в Ведах, — не Бог мира, то само собой утвердилось учение о мире без Бога. Шива, Шива! Непостижима ты, майя Вишну, — поклон тебе!</w:t>
+      </w:r>
+    </w:p>
+    <w:p>
+      <w:pPr>
+        <w:spacing w:after="60"/>
+        <w:ind w:left="510" w:hanging="510"/>
+      </w:pPr>
+      <w:r>
+        <w:rPr>
+          <w:b/>
+          <w:i w:val="0"/>
+        </w:rPr>
+        <w:t>43.</w:t>
+      </w:r>
+      <w:r>
+        <w:t xml:space="preserve"> Позор блестящему роду, позор красноречию, позор славе, позор учёности, красивой наружности, юности и богатству; позор и рождению дваждырождённым, и чистому ашраму, и всему прочему, — если в век Кали не узнал Гауру, явленного владыку гопи.</w:t>
+      </w:r>
+    </w:p>
+    <w:p>
+      <w:pPr>
+        <w:spacing w:after="60"/>
+        <w:ind w:left="510" w:hanging="510"/>
+      </w:pPr>
+      <w:r>
+        <w:rPr>
+          <w:b/>
+          <w:i w:val="0"/>
+        </w:rPr>
+        <w:t>44.</w:t>
+      </w:r>
+      <w:r>
+        <w:t xml:space="preserve"> О! Даже лучшие спутники Господа, живущие на Вайкунтхе, смотрят с трепетом, от которого встают волосы, на его слуг — Вакрешвару и других, чьи тела всегда во власти неистовства от дивной расы, сияющей великой любовью. Как же лишённый заслуг полюбит того Гауру?</w:t>
+      </w:r>
+    </w:p>
+    <w:p>
+      <w:pPr>
+        <w:spacing w:after="60"/>
+        <w:ind w:left="510" w:hanging="510"/>
+      </w:pPr>
+      <w:r>
+        <w:rPr>
+          <w:b/>
+          <w:i w:val="0"/>
+        </w:rPr>
+        <w:t>45.</w:t>
+      </w:r>
+      <w:r>
+        <w:t xml:space="preserve"> Он дарует милость кому бы то ни было, затем заговаривает с ним, и прекрасное лицо его улыбается; издали он смотрит на него ласковым взглядом и дарует праздник великой любви. Те же, увы, чей ум огрубел от ложных рассуждений, не почитают как должно даже его — Хари, нисшедшего воплощением полной расы. Они попросту злы.</w:t>
+      </w:r>
+    </w:p>
+    <w:p>
+      <w:pPr>
+        <w:pStyle w:val="Heading2"/>
+      </w:pPr>
+      <w:r>
+        <w:t>Смирение (дайнья)</w:t>
+      </w:r>
+    </w:p>
+    <w:p>
+      <w:pPr>
+        <w:spacing w:after="60"/>
+        <w:ind w:left="510" w:hanging="510"/>
+      </w:pPr>
+      <w:r>
+        <w:rPr>
+          <w:b/>
+          <w:i w:val="0"/>
+        </w:rPr>
+        <w:t>46.</w:t>
+      </w:r>
+      <w:r>
+        <w:t xml:space="preserve"> Я обманут, я обманут, я обманут — нет сомнений! Весь мир погрузился в расу Гауры, а меня она даже не коснулась.</w:t>
+      </w:r>
+    </w:p>
+    <w:p>
+      <w:pPr>
+        <w:spacing w:after="60"/>
+        <w:ind w:left="510" w:hanging="510"/>
+      </w:pPr>
+      <w:r>
+        <w:rPr>
+          <w:b/>
+          <w:i w:val="0"/>
+        </w:rPr>
+        <w:t>47.</w:t>
+      </w:r>
+      <w:r>
+        <w:t xml:space="preserve"> Высшая из целей человека была обретена здесь даже теми, кто не прилагал никаких усилий, — на земле, которой коснулась пыль с лотосных стоп Гауры. Увы, увы! Позор моей жизни, позор моей учёности, позор моему ашраму, — по моему великому злосчастью у меня не было даже запаха связи с ним!</w:t>
+      </w:r>
+    </w:p>
+    <w:p>
+      <w:pPr>
+        <w:spacing w:after="60"/>
+        <w:ind w:left="510" w:hanging="510"/>
+      </w:pPr>
+      <w:r>
+        <w:rPr>
+          <w:b/>
+          <w:i w:val="0"/>
+        </w:rPr>
+        <w:t>48.</w:t>
+      </w:r>
+      <w:r>
+        <w:t xml:space="preserve"> Великий океан милости Гаурачандры вышел из берегов и затопил весь мир — но на меня, великого несчастливца, не упало и капли. Что за чудо!</w:t>
+      </w:r>
+    </w:p>
+    <w:p>
+      <w:pPr>
+        <w:spacing w:after="60"/>
+        <w:ind w:left="510" w:hanging="510"/>
+      </w:pPr>
+      <w:r>
+        <w:rPr>
+          <w:b/>
+          <w:i w:val="0"/>
+        </w:rPr>
+        <w:t>49.</w:t>
+      </w:r>
+      <w:r>
+        <w:t xml:space="preserve"> Время — Кали; враги-чувства сильны; путь святой бхакти здесь перегорожен миллионами шипов. Увы, увы, куда мне идти, обезумевшему? Что мне делать, о Чайтанья-Луна, если ты сегодня не явишь милости?</w:t>
+      </w:r>
+    </w:p>
+    <w:p>
+      <w:pPr>
+        <w:spacing w:after="60"/>
+        <w:ind w:left="510" w:hanging="510"/>
+      </w:pPr>
+      <w:r>
+        <w:rPr>
+          <w:b/>
+          <w:i w:val="0"/>
+        </w:rPr>
+        <w:t>50.</w:t>
+      </w:r>
+      <w:r>
+        <w:t xml:space="preserve"> Дивный Господь так и не предстал моим глазам, я так и не вкусил расы лотосных стоп Хари, — что ушло, то ушло. Но пусть у меня будет хотя бы одно: праздник общения с теми, кто, украшая собою землю, утвердил свой ум в стопах Шри Чайтаньи.</w:t>
+      </w:r>
+    </w:p>
+    <w:p>
+      <w:pPr>
+        <w:spacing w:after="60"/>
+        <w:ind w:left="510" w:hanging="510"/>
+      </w:pPr>
+      <w:r>
+        <w:rPr>
+          <w:b/>
+          <w:i w:val="0"/>
+        </w:rPr>
+        <w:t>51.</w:t>
+      </w:r>
+      <w:r>
+        <w:t xml:space="preserve"> Я предан миллионам дурных дел, накрепко скован цепями бесконечных, страшных дурных наклонностей; ум мой мучится, его терзают миллионы ложных воззрений. Кто, кроме Гауры, станет мне здесь сегодня другом?</w:t>
+      </w:r>
+    </w:p>
+    <w:p>
+      <w:pPr>
+        <w:spacing w:after="60"/>
+        <w:ind w:left="510" w:hanging="510"/>
+      </w:pPr>
+      <w:r>
+        <w:rPr>
+          <w:b/>
+          <w:i w:val="0"/>
+        </w:rPr>
+        <w:t>52.</w:t>
+      </w:r>
+      <w:r>
+        <w:t xml:space="preserve"> Увы, увы! На крайне бесплодной почве моего сердца пропадают даром даже миллионы моих практик. Поэтому всей душой я принимаю прибежище стоп Шри Гаурачандры — дивного семени бхакти.</w:t>
+      </w:r>
+    </w:p>
+    <w:p>
+      <w:pPr>
+        <w:spacing w:after="60"/>
+        <w:ind w:left="510" w:hanging="510"/>
+      </w:pPr>
+      <w:r>
+        <w:rPr>
+          <w:b/>
+          <w:i w:val="0"/>
+        </w:rPr>
+        <w:t>53.</w:t>
+      </w:r>
+      <w:r>
+        <w:t xml:space="preserve"> Увы, увы! Как на крайне бесплодной почве моего сердца пробьётся росток лианы желаний истинной бхакти? Но в сердце есть одно высшее утешение: повторяющий имя «Чайтанья» никогда не будет достоин сожаления.</w:t>
+      </w:r>
+    </w:p>
+    <w:p>
+      <w:pPr>
+        <w:spacing w:after="60"/>
+        <w:ind w:left="510" w:hanging="510"/>
+      </w:pPr>
+      <w:r>
+        <w:rPr>
+          <w:b/>
+          <w:i w:val="0"/>
+        </w:rPr>
+        <w:t>54.</w:t>
+      </w:r>
+      <w:r>
+        <w:t xml:space="preserve"> Я упал в океан мирских страданий, меня проглотили крокодилы и чудовища вожделения, гнева и прочего, я скован дурными наклонностями, лишён прибежища. О Чайтанья-Луна, дай мне опору своих стоп!</w:t>
+      </w:r>
+    </w:p>
+    <w:p>
+      <w:pPr>
+        <w:spacing w:after="60"/>
+        <w:ind w:left="510" w:hanging="510"/>
+      </w:pPr>
+      <w:r>
+        <w:rPr>
+          <w:b/>
+          <w:i w:val="0"/>
+        </w:rPr>
+        <w:t>55.</w:t>
+      </w:r>
+      <w:r>
+        <w:t xml:space="preserve"> Того дивного пути бхакти, который ищут Шива, Шука, Уддхава, Нарада и другие, — и мы не далеки, о Чайтанья-Луна, владыка непостижимого богатства, если твой милостивый взгляд падёт даже на меня, ничтожного.</w:t>
+      </w:r>
+    </w:p>
+    <w:p>
+      <w:pPr>
+        <w:spacing w:after="60"/>
+        <w:ind w:left="510" w:hanging="510"/>
+      </w:pPr>
+      <w:r>
+        <w:rPr>
+          <w:b/>
+          <w:i w:val="0"/>
+        </w:rPr>
+        <w:t>56.</w:t>
+      </w:r>
+      <w:r>
+        <w:t xml:space="preserve"> О Шаури (Кришна)! Где ещё такая безудержная милость, где такое дивное величие, где такая нежность, как в тебе самом в облике Гауры?</w:t>
+      </w:r>
+    </w:p>
+    <w:p>
+      <w:r>
+        <w:br w:type="page"/>
+      </w:r>
+    </w:p>
+    <w:p>
+      <w:pPr>
+        <w:pStyle w:val="Heading1"/>
+        <w:jc w:val="center"/>
+      </w:pPr>
+      <w:r>
+        <w:t>Часть 3</w:t>
+      </w:r>
+    </w:p>
+    <w:p>
+      <w:pPr>
+        <w:spacing w:after="60"/>
+        <w:jc w:val="both"/>
+      </w:pPr>
+      <w:r>
+        <w:rPr>
+          <w:b w:val="0"/>
+          <w:i/>
+        </w:rPr>
+        <w:t>Верность предмету поклонения. Наставление миру (шлоки 57–98)</w:t>
+      </w:r>
+    </w:p>
+    <w:p>
+      <w:pPr>
+        <w:pStyle w:val="Heading2"/>
+      </w:pPr>
+      <w:r>
+        <w:t>Верность предмету поклонения (упасья-ништха)</w:t>
+      </w:r>
+    </w:p>
+    <w:p>
+      <w:pPr>
+        <w:spacing w:after="60"/>
+        <w:ind w:left="510" w:hanging="510"/>
+      </w:pPr>
+      <w:r>
+        <w:rPr>
+          <w:b/>
+          <w:i w:val="0"/>
+        </w:rPr>
+        <w:t>57.</w:t>
+      </w:r>
+      <w:r>
+        <w:t xml:space="preserve"> О глупое сердце, прими Гаурангу — Владыку, который собственным сиянием погрузил весь мир в великую расу лотосных стоп Кришны, неописуемого, чей облик сокрыт во всех шрути!</w:t>
+      </w:r>
+    </w:p>
+    <w:p>
+      <w:pPr>
+        <w:spacing w:after="60"/>
+        <w:ind w:left="510" w:hanging="510"/>
+      </w:pPr>
+      <w:r>
+        <w:rPr>
+          <w:b/>
+          <w:i w:val="0"/>
+        </w:rPr>
+        <w:t>58.</w:t>
+      </w:r>
+      <w:r>
+        <w:t xml:space="preserve"> Если кто-то через бхакти к Мурари — слушание, размышление, воспевание и прочее — достигает высшей цели человека, — благо ему. А мне достойна поклонения неописуемая тайна расы того, чья обитель — Гаура</w:t>
       </w:r>
       <w:r>
         <w:rPr>
@@ -1115,7 +1454,7 @@
         <w:t>1</w:t>
       </w:r>
       <w:r>
-        <w:t>. Если этот Гаурачандра, сокрытый в Ведах, — не Бог мира, то само собой утвердилось учение о мире без Бога. Шива, Шива! Непостижима ты, майя Вишну, — поклон тебе!</w:t>
+        <w:t>, океана нектара высшей любви, не знающего берегов.</w:t>
       </w:r>
     </w:p>
     <w:p>
@@ -1128,10 +1467,10 @@
           <w:b/>
           <w:i w:val="0"/>
         </w:rPr>
-        <w:t>43.</w:t>
-      </w:r>
-      <w:r>
-        <w:t xml:space="preserve"> Позор блестящему роду, позор красноречию, позор славе, позор учёности, красоте, прелести юности; позор и рождению дваждырождённым, и чистому ашраму, и всему прочему, — если в век Кали не узнал Гауру, явленного владыку гопи.</w:t>
+        <w:t>59.</w:t>
+      </w:r>
+      <w:r>
+        <w:t xml:space="preserve"> Пусть одни поклоняются Владыке, надеясь на четыре цели человека, пусть другие, оставив иные предметы поклонения, станут слугами Хари. Мой же ум прельщён некой сокровенной ступенью, и я принимаю прибежище стоп Чайтаньи-Луны.</w:t>
       </w:r>
     </w:p>
     <w:p>
@@ -1144,10 +1483,10 @@
           <w:b/>
           <w:i w:val="0"/>
         </w:rPr>
-        <w:t>44.</w:t>
-      </w:r>
-      <w:r>
-        <w:t xml:space="preserve"> О! Даже лучшие спутники Господа, живущие на Вайкунтхе, смотрят с трепетом, от которого встают волосы, на его слуг — Вакрешвару и других, чьи тела всегда во власти неистовства от дивной расы, сияющей великой любовью. Как же лишённый заслуг полюбит того Гауру?</w:t>
+        <w:t>60.</w:t>
+      </w:r>
+      <w:r>
+        <w:t xml:space="preserve"> Череда мирских и ведических дел, в которых я утвердился; стыдливость при шутках, громком пении, танце и на празднествах; природные обязанности, связанные с жизнью и телом, — увы! всё это похитил некий вор — Гаура, чья сила неодолима.</w:t>
       </w:r>
     </w:p>
     <w:p>
@@ -1160,18 +1499,10 @@
           <w:b/>
           <w:i w:val="0"/>
         </w:rPr>
-        <w:t>45.</w:t>
-      </w:r>
-      <w:r>
-        <w:t xml:space="preserve"> Он дарует милость, увидев кого бы то ни было; он заговаривает с ним, и прекрасное лицо его улыбается; издали он смотрит на него ласковым взглядом и дарует праздник великой любви. Те же, чей ум огрубел от ложных рассуждений, не почитают как должно даже его — Хари, нисшедшего воплощением полной расы. Они попросту злы.</w:t>
-      </w:r>
-    </w:p>
-    <w:p>
-      <w:pPr>
-        <w:pStyle w:val="Heading2"/>
-      </w:pPr>
-      <w:r>
-        <w:t>Смирение (дайнья)</w:t>
+        <w:t>61.</w:t>
+      </w:r>
+      <w:r>
+        <w:t xml:space="preserve"> Изливая миллионы океанов нектара любви, сотканной из густой и сияющей расы блаженства, неописуемым уголком глаз, увлажнённых состраданием, — кто этот Бог, чьё стройное золотое тело подобно сердцевине золотого бананового дерева, что внезапно накрепко привязал мой ум к своим стопам?</w:t>
       </w:r>
     </w:p>
     <w:p>
@@ -1184,10 +1515,10 @@
           <w:b/>
           <w:i w:val="0"/>
         </w:rPr>
-        <w:t>46.</w:t>
-      </w:r>
-      <w:r>
-        <w:t xml:space="preserve"> Я обманут, я обманут, я обманут — нет сомнений! Весь мир погрузился в расу Гауры, а меня она даже не коснулась.</w:t>
+        <w:t>62.</w:t>
+      </w:r>
+      <w:r>
+        <w:t xml:space="preserve"> Там, где по милости явился сам Бог, золотой, как расплавленное золото, чьё тело — сияющая раса великой любви и блаженства, — в Навадвипе, где в каждом доме праздник бхакти, — в этой сладкой обители мой ум находит радость больше, чем на Вайкунтхе.</w:t>
       </w:r>
     </w:p>
     <w:p>
@@ -1200,10 +1531,10 @@
           <w:b/>
           <w:i w:val="0"/>
         </w:rPr>
-        <w:t>47.</w:t>
-      </w:r>
-      <w:r>
-        <w:t xml:space="preserve"> Высшая из целей человека была обретена здесь даже теми, кто не прилагал никаких усилий, — на земле, которой коснулась пыль с лотосных стоп Гауры. Увы, увы! Позор моей жизни, позор моей учёности, позор моему ашраму, — по моему великому злосчастью у меня не было даже запаха связи с ним!</w:t>
+        <w:t>63.</w:t>
+      </w:r>
+      <w:r>
+        <w:t xml:space="preserve"> Пусть шастры говорят что угодно, пусть логики толкуют как угодно, — моя жизнь лишь в нектаре лотосных стоп Чайтаньи.</w:t>
       </w:r>
     </w:p>
     <w:p>
@@ -1216,10 +1547,10 @@
           <w:b/>
           <w:i w:val="0"/>
         </w:rPr>
-        <w:t>48.</w:t>
-      </w:r>
-      <w:r>
-        <w:t xml:space="preserve"> Великий океан милости Гаурачандры вышел из берегов и затопил весь мир — но на меня, великого несчастливца, не упало и капли. Что за чудо!</w:t>
+        <w:t>64.</w:t>
+      </w:r>
+      <w:r>
+        <w:t xml:space="preserve"> Пусть мне в ладонь сами упадут труднодостижимые сиддхи, пусть сами боги придут, чтобы стать моими слугами, пусть, наконец, у меня окажется четырёхрукое тело, — мой ум и на миг не отклонится от Гаурачандры.</w:t>
       </w:r>
     </w:p>
     <w:p>
@@ -1232,10 +1563,10 @@
           <w:b/>
           <w:i w:val="0"/>
         </w:rPr>
-        <w:t>49.</w:t>
-      </w:r>
-      <w:r>
-        <w:t xml:space="preserve"> Время — Кали; враги-чувства сильны; путь святой бхакти здесь перегорожен миллионами шипов. Увы, увы, куда мне идти, обезумевшему? Что мне делать, о Чайтанья-Луна, если ты сегодня не явишь милости?</w:t>
+        <w:t>65.</w:t>
+      </w:r>
+      <w:r>
+        <w:t xml:space="preserve"> Лучше мне жить в клетке из языков страшного пламени, чем где-либо общаться с теми, кто отвернулся от лотосных стоп Шри Чайтаньи. Даже если сама собой придёт обитель Вайкунтхи и прочее, мой ум не пожелает её, если не вкусит хоть немного блеска пыли с лотосных стоп Гауры.</w:t>
       </w:r>
     </w:p>
     <w:p>
@@ -1248,10 +1579,10 @@
           <w:b/>
           <w:i w:val="0"/>
         </w:rPr>
-        <w:t>50.</w:t>
-      </w:r>
-      <w:r>
-        <w:t xml:space="preserve"> Дивный Господь так и не предстал моим глазам, я так и не вкусил расы лотосных стоп Хари, — что ушло, то ушло. Но пусть у меня будет хотя бы одно: праздник общения с теми, кто, украшая собою землю, утвердил свой ум в стопах Шри Чайтаньи.</w:t>
+        <w:t>66.</w:t>
+      </w:r>
+      <w:r>
+        <w:t xml:space="preserve"> Пусть по всей земле идёт обо мне молва: «Велик, велик!» Пусть миру явится великая дивная сиддхи. Пусть, поклоняясь Владыке вселенной, обрету прекрасный четырёхрукий облик. нет, нет — без бхакти к Шри Гауре мой ум ничего этого не ценит!</w:t>
       </w:r>
     </w:p>
     <w:p>
@@ -1264,10 +1595,10 @@
           <w:b/>
           <w:i w:val="0"/>
         </w:rPr>
-        <w:t>51.</w:t>
-      </w:r>
-      <w:r>
-        <w:t xml:space="preserve"> Я предан миллионам дурных дел, накрепко скован цепями бесконечных, страшных дурных наклонностей; ум мой мучится, его терзают миллионы ложных воззрений. Кто, кроме Гауры, станет мне здесь сегодня другом?</w:t>
+        <w:t>67.</w:t>
+      </w:r>
+      <w:r>
+        <w:t xml:space="preserve"> «Чайтанья! Милостивый! Высший щедрец! Ты, наполнивший сердца всех существ любовью разных видов! Обитель чудес! Гауранга! Океан достоинств! Воплощение расы! Ты, любящий свои имена!» — молю, чтобы так, неустанно повторяя, я провёл эту жизнь.</w:t>
       </w:r>
     </w:p>
     <w:p>
@@ -1280,10 +1611,10 @@
           <w:b/>
           <w:i w:val="0"/>
         </w:rPr>
-        <w:t>52.</w:t>
-      </w:r>
-      <w:r>
-        <w:t xml:space="preserve"> Увы, увы! На крайне бесплодной почве моего сердца пропадают даром даже миллионы моих практик. Поэтому всей душой я принимаю прибежище стоп Шри Гаурачандры — дивного семени бхакти.</w:t>
+        <w:t>68.</w:t>
+      </w:r>
+      <w:r>
+        <w:t xml:space="preserve"> О Шаури! Когда возникнет у меня бесхитростное чувство к твоему телу Гауры, дарующему расу высшей любви, — к единственной жизни святых? Или когда благодаря неземному, истинному умозаключению из этого чувства в моём сердце внезапно взойдёт сияние драгоценных ногтей на стопах Шри Радхи?</w:t>
       </w:r>
     </w:p>
     <w:p>
@@ -1296,10 +1627,10 @@
           <w:b/>
           <w:i w:val="0"/>
         </w:rPr>
-        <w:t>53.</w:t>
-      </w:r>
-      <w:r>
-        <w:t xml:space="preserve"> Увы, увы! Как на крайне бесплодной почве моего сердца пробьётся росток лианы желаний истинной бхакти? Но в сердце есть одно высшее утешение: повторяющий имя «Чайтанья» никогда не будет достоин сожаления.</w:t>
+        <w:t>69.</w:t>
+      </w:r>
+      <w:r>
+        <w:t xml:space="preserve"> носящего гирлянду из пышно цветущей даманаки, радующего всех людей, наслаждающегося в уединённых садах, непрестанно повторяющего Имя, обитель милосердия, сияющего золотом Гауры, — высшую обитель по имени Чайтанья мы созерцаем.</w:t>
       </w:r>
     </w:p>
     <w:p>
@@ -1312,10 +1643,21 @@
           <w:b/>
           <w:i w:val="0"/>
         </w:rPr>
-        <w:t>54.</w:t>
-      </w:r>
-      <w:r>
-        <w:t xml:space="preserve"> Я упал в океан мирских страданий, меня проглотили крокодилы и чудовища вожделения, гнева и прочего, я скован дурными наклонностями, лишён прибежища. О Чайтанья-Луна, дай мне опору своих стоп!</w:t>
+        <w:t>70.</w:t>
+      </w:r>
+      <w:r>
+        <w:t xml:space="preserve"> Пусть мой ум помнит Гаурангу, отрешённого от всего: его глаза — пчёлы на сияющем лотосе лица Хари, что всегда играет на праздничной вершине Ниладри</w:t>
+      </w:r>
+      <w:r>
+        <w:rPr>
+          <w:b w:val="0"/>
+          <w:i w:val="0"/>
+          <w:vertAlign w:val="superscript"/>
+        </w:rPr>
+        <w:t>2</w:t>
+      </w:r>
+      <w:r>
+        <w:t>; в нём вздымаются высокие волны опьяняющей расы любви; для ланеоких он — сам Ананга (бесплотный Камадева).</w:t>
       </w:r>
     </w:p>
     <w:p>
@@ -1328,10 +1670,10 @@
           <w:b/>
           <w:i w:val="0"/>
         </w:rPr>
-        <w:t>55.</w:t>
-      </w:r>
-      <w:r>
-        <w:t xml:space="preserve"> Того дивного пути бхакти, который ищут Шива, Шука, Уддхава, Нарада и другие, — и мы не далеки, о Чайтанья-Луна, владыка непостижимого богатства, если твой милостивый взгляд падёт даже на меня, ничтожного.</w:t>
+        <w:t>71.</w:t>
+      </w:r>
+      <w:r>
+        <w:t xml:space="preserve"> Его тело украшают капли слёз, струящиеся из лотосных глаз, прелестные, как лучшие жемчужины; высшую его красоту составляет и вставший на теле трепет. Прибегаю к Гауре — Хари, носящему одежду цвета алой зари.</w:t>
       </w:r>
     </w:p>
     <w:p>
@@ -1344,10 +1686,442 @@
           <w:b/>
           <w:i w:val="0"/>
         </w:rPr>
-        <w:t>56.</w:t>
-      </w:r>
-      <w:r>
-        <w:t xml:space="preserve"> О Шаури (Кришна)! Где ещё такая безудержная милость, где такое дивное величие, где такая нежность, как в тебе самом в облике Гауры?</w:t>
+        <w:t>72.</w:t>
+      </w:r>
+      <w:r>
+        <w:t xml:space="preserve"> Прекраснее Кандарпы, — о! — чище потоков небесной реки, прохладнее луны, слаще лучшего мёда, щедрее древа желаний, нежнее матери в своей любви, — когда же Гаурахари, о котором я размышляю, с любовью ступит в моё сердце?</w:t>
+      </w:r>
+    </w:p>
+    <w:p>
+      <w:pPr>
+        <w:spacing w:after="60"/>
+        <w:ind w:left="510" w:hanging="510"/>
+      </w:pPr>
+      <w:r>
+        <w:rPr>
+          <w:b/>
+          <w:i w:val="0"/>
+        </w:rPr>
+        <w:t>73.</w:t>
+      </w:r>
+      <w:r>
+        <w:t xml:space="preserve"> Раз за разом даруя груды сладчайшего хмельного мёда любви, сам безмерно милостивый, радуя этот мир, — единственный Бог, на чьих бёдрах прелестная одежда цвета марены, чьё сияние посрамляет миллионы новых молний, — он один мне дорог.</w:t>
+      </w:r>
+    </w:p>
+    <w:p>
+      <w:pPr>
+        <w:spacing w:after="60"/>
+        <w:ind w:left="510" w:hanging="510"/>
+      </w:pPr>
+      <w:r>
+        <w:rPr>
+          <w:b/>
+          <w:i w:val="0"/>
+        </w:rPr>
+        <w:t>74.</w:t>
+      </w:r>
+      <w:r>
+        <w:t xml:space="preserve"> Его красота посрамляет миллионы миллионов Маданов, сияние его прекрасного лица-луны затмевает свет миллионов миллионов восходящих осенних лун, щедростью он умаляет древо желаний, умноженное миллионы миллионов раз, — благодаря удаче миллионов миллионов рождений Гаура ступит в моё сердце.</w:t>
+      </w:r>
+    </w:p>
+    <w:p>
+      <w:pPr>
+        <w:spacing w:after="60"/>
+        <w:ind w:left="510" w:hanging="510"/>
+      </w:pPr>
+      <w:r>
+        <w:rPr>
+          <w:b/>
+          <w:i w:val="0"/>
+        </w:rPr>
+        <w:t>75.</w:t>
+      </w:r>
+      <w:r>
+        <w:t xml:space="preserve"> То исхудавший, то полный, — ах! — то в слезах, то улыбающийся, то холодный, то пылающий, будто от огня, то бегущий, то оцепеневший, то говорящий без умолку, — о! — то немой — да явится в моём сердце Гаура, тело Господа.</w:t>
+      </w:r>
+    </w:p>
+    <w:p>
+      <w:pPr>
+        <w:spacing w:after="60"/>
+        <w:ind w:left="510" w:hanging="510"/>
+      </w:pPr>
+      <w:r>
+        <w:rPr>
+          <w:b/>
+          <w:i w:val="0"/>
+        </w:rPr>
+        <w:t>76.</w:t>
+      </w:r>
+      <w:r>
+        <w:t xml:space="preserve"> Господь не разбирает, достоин ли человек или недостоин, не смотрит, свой он или чужой, не взвешивает, что можно дать и чего нельзя, не ждёт подходящего времени. Тот, кто через слушание о нём, лицезрение, поклоны, медитацию и прочее тотчас дарует труднодостижимую расу бхакти, — этот Господь Гаура — моё высшее прибежище.</w:t>
+      </w:r>
+    </w:p>
+    <w:p>
+      <w:pPr>
+        <w:spacing w:after="60"/>
+        <w:ind w:left="510" w:hanging="510"/>
+      </w:pPr>
+      <w:r>
+        <w:rPr>
+          <w:b/>
+          <w:i w:val="0"/>
+        </w:rPr>
+        <w:t>77.</w:t>
+      </w:r>
+      <w:r>
+        <w:t xml:space="preserve"> Будь человек величайшим грешником, низкорождённым, порочным, пределом дурных дел, хуже собакоеда, вечно полным дурных наклонностей, рождённым в дурной стране и живущим там, погибшим от дурного общества, — он всё равно спасён по милости Гауры. Прибегаю лишь к этому Гауре.</w:t>
+      </w:r>
+    </w:p>
+    <w:p>
+      <w:pPr>
+        <w:spacing w:after="60"/>
+        <w:ind w:left="510" w:hanging="510"/>
+      </w:pPr>
+      <w:r>
+        <w:rPr>
+          <w:b/>
+          <w:i w:val="0"/>
+        </w:rPr>
+        <w:t>78.</w:t>
+      </w:r>
+      <w:r>
+        <w:t xml:space="preserve"> Оставив сияющий Вриндаван на берегу дочери Калинды (Ямуны), он ушёл в цветущие сады на берегу солёного океана; надел одеяние цвета зари, отбросив прекрасное жёлтое; скрыв собственный облик, явил золотистость. Этот Хари — моё прибежище.</w:t>
+      </w:r>
+    </w:p>
+    <w:p>
+      <w:pPr>
+        <w:pStyle w:val="Heading2"/>
+      </w:pPr>
+      <w:r>
+        <w:t>Наставление миру (лока-шикша)</w:t>
+      </w:r>
+    </w:p>
+    <w:p>
+      <w:pPr>
+        <w:spacing w:after="60"/>
+        <w:ind w:left="510" w:hanging="510"/>
+      </w:pPr>
+      <w:r>
+        <w:rPr>
+          <w:b/>
+          <w:i w:val="0"/>
+        </w:rPr>
+        <w:t>79.</w:t>
+      </w:r>
+      <w:r>
+        <w:t xml:space="preserve"> Эй, глупцы! Ищите сокровенный путь преданности Хари, неведомый прежде лучшим мудрецам даже при их далеко видящем взоре. А если в сердце нет веры или он кажется недостижимым — оставьте всё и примите прибежище стоп Гауры.</w:t>
+      </w:r>
+    </w:p>
+    <w:p>
+      <w:pPr>
+        <w:spacing w:after="60"/>
+        <w:ind w:left="510" w:hanging="510"/>
+      </w:pPr>
+      <w:r>
+        <w:rPr>
+          <w:b/>
+          <w:i w:val="0"/>
+        </w:rPr>
+        <w:t>80.</w:t>
+      </w:r>
+      <w:r>
+        <w:t xml:space="preserve"> Он держит на голове сложенные лотосы ладоней, словно бутон; его нежные щёки омыты струящимися слезами; одет он в ткань цвета тычинок свежего лотоса. Поклоняйтесь этому высшему свету — Гауре, похитителю золотого сияния!</w:t>
+      </w:r>
+    </w:p>
+    <w:p>
+      <w:pPr>
+        <w:spacing w:after="60"/>
+        <w:ind w:left="510" w:hanging="510"/>
+      </w:pPr>
+      <w:r>
+        <w:rPr>
+          <w:b/>
+          <w:i w:val="0"/>
+        </w:rPr>
+        <w:t>81.</w:t>
+      </w:r>
+      <w:r>
+        <w:t xml:space="preserve"> Громко воспевай могущественную череду имён владыки Гокулы или созерцай его божественный, сладкий облик, несущий благо миру, — но, увы, даже надежды на ступень сияющей великой расы любви у тебя не будет, если не падёт на тебя милостивый взгляд Шри Чайтаньи Махапрабху.</w:t>
+      </w:r>
+    </w:p>
+    <w:p>
+      <w:pPr>
+        <w:spacing w:after="60"/>
+        <w:ind w:left="510" w:hanging="510"/>
+      </w:pPr>
+      <w:r>
+        <w:rPr>
+          <w:b/>
+          <w:i w:val="0"/>
+        </w:rPr>
+        <w:t>82.</w:t>
+      </w:r>
+      <w:r>
+        <w:t xml:space="preserve"> Эй, не берись опрометчиво за иное! над всеми твоими усилиями смеются люди вокруг, опьянённые вкусом нектара Хари-расы. Выслушай же сокровенное: то, что в Ведах представлено как предмет любви, — его владыка именно этот Гаура, и только он.</w:t>
+      </w:r>
+    </w:p>
+    <w:p>
+      <w:pPr>
+        <w:spacing w:after="60"/>
+        <w:ind w:left="510" w:hanging="510"/>
+      </w:pPr>
+      <w:r>
+        <w:rPr>
+          <w:b/>
+          <w:i w:val="0"/>
+        </w:rPr>
+        <w:t>83.</w:t>
+      </w:r>
+      <w:r>
+        <w:t xml:space="preserve"> «Пути преданности владыке Враджа, отвращающего от пути знания и прочего, я не знаю; истинные гуру мне не встречаются; увы, увы, кто мне прибежище?» — О глупец! неужто Гаура-Хари так и не достиг твоих ушей?</w:t>
+      </w:r>
+    </w:p>
+    <w:p>
+      <w:pPr>
+        <w:spacing w:after="60"/>
+        <w:ind w:left="510" w:hanging="510"/>
+      </w:pPr>
+      <w:r>
+        <w:rPr>
+          <w:b/>
+          <w:i w:val="0"/>
+        </w:rPr>
+        <w:t>84.</w:t>
+      </w:r>
+      <w:r>
+        <w:t xml:space="preserve"> Оставьте напрасную увлечённость обрядами, не подпускайте к ушам даже разговоров о пути созерцания Атмана, не предавайтесь заблуждению о теле и прочем — и по милости Гауры к вам придёт венец целей человека, высшим образом дивный и сладкий.</w:t>
+      </w:r>
+    </w:p>
+    <w:p>
+      <w:pPr>
+        <w:spacing w:after="60"/>
+        <w:ind w:left="510" w:hanging="510"/>
+      </w:pPr>
+      <w:r>
+        <w:rPr>
+          <w:b/>
+          <w:i w:val="0"/>
+        </w:rPr>
+        <w:t>85.</w:t>
+      </w:r>
+      <w:r>
+        <w:t xml:space="preserve"> Довольно изучения шастр! Довольно, ах, паломничеств! Всегда страшитесь тигрицы — женщины; считая соломинкой бренные небеса, плюньте на них! О счастливцы, примите прибежище Гауранги, принявшего личину санньясина, — он пляшет на берегу океана, опьянённый собственной расой.</w:t>
+      </w:r>
+    </w:p>
+    <w:p>
+      <w:pPr>
+        <w:spacing w:after="60"/>
+        <w:ind w:left="510" w:hanging="510"/>
+      </w:pPr>
+      <w:r>
+        <w:rPr>
+          <w:b/>
+          <w:i w:val="0"/>
+        </w:rPr>
+        <w:t>86.</w:t>
+      </w:r>
+      <w:r>
+        <w:t xml:space="preserve"> К чему, увы, бесплодно утруждать себя на труднопроходимых путях йоги и прочих? Посвятив бхакти лотосным стопам Кришны, вы обретёте все цели. А если есть надежда на дивный великий праздник любви, недоступный Шиве, Брахме и другим, — тогда отдайтесь Гауре, обители, чьё щедрое величие непостижимо.</w:t>
+      </w:r>
+    </w:p>
+    <w:p>
+      <w:pPr>
+        <w:spacing w:after="60"/>
+        <w:ind w:left="510" w:hanging="510"/>
+      </w:pPr>
+      <w:r>
+        <w:rPr>
+          <w:b/>
+          <w:i w:val="0"/>
+        </w:rPr>
+        <w:t>87.</w:t>
+      </w:r>
+      <w:r>
+        <w:t xml:space="preserve"> По мере того как совершивший груды благих дел обретает бхакти к лотосным стопам Гауры, в его сердце внезапно вздымается океан нектара лотосных стоп Радхи.</w:t>
+      </w:r>
+    </w:p>
+    <w:p>
+      <w:pPr>
+        <w:spacing w:after="60"/>
+        <w:ind w:left="510" w:hanging="510"/>
+      </w:pPr>
+      <w:r>
+        <w:rPr>
+          <w:b/>
+          <w:i w:val="0"/>
+        </w:rPr>
+        <w:t>88.</w:t>
+      </w:r>
+      <w:r>
+        <w:t xml:space="preserve"> Стопы Чайтаньи, которым поклоняются Брахма и Шива, — хранилище безбрежного океана нектара тайны расы, сияющей любовью. Поэтому пусть мудрые, созерцая их, в избытке любви ищут у них прибежища, и, обезумев, лишь о них здесь поют.</w:t>
+      </w:r>
+    </w:p>
+    <w:p>
+      <w:pPr>
+        <w:spacing w:after="60"/>
+        <w:ind w:left="510" w:hanging="510"/>
+      </w:pPr>
+      <w:r>
+        <w:rPr>
+          <w:b/>
+          <w:i w:val="0"/>
+        </w:rPr>
+        <w:t>89.</w:t>
+      </w:r>
+      <w:r>
+        <w:t xml:space="preserve"> Взяв в зубы травинку, падая к ногам, сотней жалобных мольб я говорю вот что: «О святые! Оставьте всё далеко позади и возлюбите стопы Гауранги-Луны!»</w:t>
+      </w:r>
+    </w:p>
+    <w:p>
+      <w:pPr>
+        <w:spacing w:after="60"/>
+        <w:ind w:left="510" w:hanging="510"/>
+      </w:pPr>
+      <w:r>
+        <w:rPr>
+          <w:b/>
+          <w:i w:val="0"/>
+        </w:rPr>
+        <w:t>90.</w:t>
+      </w:r>
+      <w:r>
+        <w:t xml:space="preserve"> О! Освобождение не трудно обрести, и бхакти не так уж трудно; но милость Гаурачандры труднодостижима даже на Вайкунтхе.</w:t>
+      </w:r>
+    </w:p>
+    <w:p>
+      <w:pPr>
+        <w:spacing w:after="60"/>
+        <w:ind w:left="510" w:hanging="510"/>
+      </w:pPr>
+      <w:r>
+        <w:rPr>
+          <w:b/>
+          <w:i w:val="0"/>
+        </w:rPr>
+        <w:t>91.</w:t>
+      </w:r>
+      <w:r>
+        <w:t xml:space="preserve"> Поклоняйтесь лотосным стопам Чайтаньи, исполнитесь расой истинной бхакти и радуйте три мира разнообразной сладостью, удачей, состраданием, терпением и прочим.</w:t>
+      </w:r>
+    </w:p>
+    <w:p>
+      <w:pPr>
+        <w:spacing w:after="60"/>
+        <w:ind w:left="510" w:hanging="510"/>
+      </w:pPr>
+      <w:r>
+        <w:rPr>
+          <w:b/>
+          <w:i w:val="0"/>
+        </w:rPr>
+        <w:t>92.</w:t>
+      </w:r>
+      <w:r>
+        <w:t xml:space="preserve"> Если сердце стремится переплыть океан мирского бытия, если ум радуется нектарной расе санкиртаны, если мысль желает играть в океане любви, — пусть принимает прибежище стоп Чайтаньи-Луны.</w:t>
+      </w:r>
+    </w:p>
+    <w:p>
+      <w:pPr>
+        <w:spacing w:after="60"/>
+        <w:ind w:left="510" w:hanging="510"/>
+      </w:pPr>
+      <w:r>
+        <w:rPr>
+          <w:b/>
+          <w:i w:val="0"/>
+        </w:rPr>
+        <w:t>93.</w:t>
+      </w:r>
+      <w:r>
+        <w:t xml:space="preserve"> Пусть знание, отречение, бхакти и прочее совершают как угодно, — но где то, что сравнится с достигаемым бхакти к лотосным стопам Чайтаньи?</w:t>
+      </w:r>
+      <w:r>
+        <w:rPr>
+          <w:b w:val="0"/>
+          <w:i w:val="0"/>
+          <w:vertAlign w:val="superscript"/>
+        </w:rPr>
+        <w:t>3</w:t>
+      </w:r>
+    </w:p>
+    <w:p>
+      <w:pPr>
+        <w:spacing w:after="60"/>
+        <w:ind w:left="510" w:hanging="510"/>
+      </w:pPr>
+      <w:r>
+        <w:rPr>
+          <w:b/>
+          <w:i w:val="0"/>
+        </w:rPr>
+        <w:t>94.</w:t>
+      </w:r>
+      <w:r>
+        <w:t xml:space="preserve"> Если этот мир не поклоняется Чайтанье — Владыке, которому поклоняются лучшие из богов, — он лишён сознания (а-чайтанья), и всюду его ждёт смерть.</w:t>
+      </w:r>
+    </w:p>
+    <w:p>
+      <w:pPr>
+        <w:spacing w:after="60"/>
+        <w:ind w:left="510" w:hanging="510"/>
+      </w:pPr>
+      <w:r>
+        <w:rPr>
+          <w:b/>
+          <w:i w:val="0"/>
+        </w:rPr>
+        <w:t>95.</w:t>
+      </w:r>
+      <w:r>
+        <w:t xml:space="preserve"> У кого есть надежда на две стопы Чайтаньи Махапрабху, тому сам Индра кажется слугой, — что уж говорить о царе-черве!</w:t>
+      </w:r>
+    </w:p>
+    <w:p>
+      <w:pPr>
+        <w:spacing w:after="60"/>
+        <w:ind w:left="510" w:hanging="510"/>
+      </w:pPr>
+      <w:r>
+        <w:rPr>
+          <w:b/>
+          <w:i w:val="0"/>
+        </w:rPr>
+        <w:t>96.</w:t>
+      </w:r>
+      <w:r>
+        <w:t xml:space="preserve"> Кто, возложив надежду на Кришну Чайтанью, станет просить у дверей царя? Какой глупец, получив чинтамани, пойдёт за серебром?</w:t>
+      </w:r>
+    </w:p>
+    <w:p>
+      <w:pPr>
+        <w:spacing w:after="60"/>
+        <w:ind w:left="510" w:hanging="510"/>
+      </w:pPr>
+      <w:r>
+        <w:rPr>
+          <w:b/>
+          <w:i w:val="0"/>
+        </w:rPr>
+        <w:t>97.</w:t>
+      </w:r>
+      <w:r>
+        <w:t xml:space="preserve"> Многие, созерцая в горных пещерах, пребывают в переживании Брахмана; на земле много сиддхов, преданных практике йоги; многие, ложно возгордившись учёностью, доблестью, богатством и прочим, пустословят. Но кто в мире сегодня без милости Гауры пляшет, опьянённый любовью?</w:t>
+      </w:r>
+    </w:p>
+    <w:p>
+      <w:pPr>
+        <w:spacing w:after="60"/>
+        <w:ind w:left="510" w:hanging="510"/>
+      </w:pPr>
+      <w:r>
+        <w:rPr>
+          <w:b/>
+          <w:i w:val="0"/>
+        </w:rPr>
+        <w:t>98.</w:t>
+      </w:r>
+      <w:r>
+        <w:t xml:space="preserve"> Я ни во что не ставлю даже жителей Каши — к чему мне искать Гаю? Освобождение для меня — пустая раковина; что уж говорить о прочих целях? Даже в великом аде Раурава мне не мерещится и тени страха — где уж тут бояться за жену, сыновей и прочее, — если милостив ко мне Бог богов Гаура.</w:t>
       </w:r>
     </w:p>
     <w:p>
@@ -1367,21 +2141,75 @@
         <w:rPr>
           <w:sz w:val="18"/>
         </w:rPr>
-        <w:t xml:space="preserve"> Первая строка шлоки в издании 1951 г. распознана лишь частично; перевод восстановлен по сохранившимся словам и хинди-переводу издания.</w:t>
+        <w:t xml:space="preserve"> </w:t>
+      </w:r>
+      <w:r>
+        <w:rPr>
+          <w:b w:val="0"/>
+          <w:i/>
+          <w:sz w:val="18"/>
+        </w:rPr>
+        <w:t>Гаура-дхаман</w:t>
+      </w:r>
+      <w:r>
+        <w:rPr>
+          <w:sz w:val="18"/>
+        </w:rPr>
+        <w:t xml:space="preserve"> — «того, чья обитель (или сияние) — Гаура», т. е. Кришны в облике Гауры.</w:t>
       </w:r>
     </w:p>
     <w:p>
-      <w:r>
-        <w:br w:type="page"/>
+      <w:pPr>
+        <w:spacing w:after="60"/>
+        <w:ind w:left="283"/>
+      </w:pPr>
+      <w:r>
+        <w:rPr>
+          <w:b/>
+          <w:i w:val="0"/>
+          <w:sz w:val="18"/>
+        </w:rPr>
+        <w:t>2.</w:t>
+      </w:r>
+      <w:r>
+        <w:rPr>
+          <w:sz w:val="18"/>
+        </w:rPr>
+        <w:t xml:space="preserve"> Вершина Ниладри (Нилачалы) — Пури; «лицо Хари» — Джаганнатха, на которого неотрывно смотрит Махапрабху.</w:t>
       </w:r>
     </w:p>
     <w:p>
       <w:pPr>
+        <w:spacing w:after="60"/>
+        <w:ind w:left="283"/>
+      </w:pPr>
+      <w:r>
+        <w:rPr>
+          <w:b/>
+          <w:i w:val="0"/>
+          <w:sz w:val="18"/>
+        </w:rPr>
+        <w:t>3.</w:t>
+      </w:r>
+      <w:r>
+        <w:rPr>
+          <w:sz w:val="18"/>
+        </w:rPr>
+        <w:t xml:space="preserve"> Первая строка восстановлена по бенгальскому изданию (там № 94).</w:t>
+      </w:r>
+    </w:p>
+    <w:p>
+      <w:r>
+        <w:br w:type="page"/>
+      </w:r>
+    </w:p>
+    <w:p>
+      <w:pPr>
         <w:pStyle w:val="Heading1"/>
         <w:jc w:val="center"/>
       </w:pPr>
       <w:r>
-        <w:t>Часть 3</w:t>
+        <w:t>Часть 4</w:t>
       </w:r>
     </w:p>
     <w:p>
@@ -1394,7 +2222,7 @@
           <w:b w:val="0"/>
           <w:i/>
         </w:rPr>
-        <w:t>Верность предмету поклонения. Наставление миру (шлоки 57–98)</w:t>
+        <w:t>Превосходство Шри Чайтаньи. Величие воплощения. Красота и танец Гауры. Скорбь (шлоки 99–142)</w:t>
       </w:r>
     </w:p>
     <w:p>
@@ -1402,7 +2230,7 @@
         <w:pStyle w:val="Heading2"/>
       </w:pPr>
       <w:r>
-        <w:t>Верность предмету поклонения (упасья-ништха)</w:t>
+        <w:t>Превосходство Шри Чайтаньи (уткарша)</w:t>
       </w:r>
     </w:p>
     <w:p>
@@ -1415,10 +2243,10 @@
           <w:b/>
           <w:i w:val="0"/>
         </w:rPr>
-        <w:t>57.</w:t>
-      </w:r>
-      <w:r>
-        <w:t xml:space="preserve"> О глупое сердце, прими Гаурангу — Владыку, который собственным сиянием погрузил весь мир в великую расу лотосных стоп Кришны, неописуемого, чей облик сокрыт во всех шрути!</w:t>
+        <w:t>99.</w:t>
+      </w:r>
+      <w:r>
+        <w:t xml:space="preserve"> С отвагой опьянённого молодого льва, стремящийся затопить мир океаном любви, нежный, как дивный, только что распустившийся золотой цветок кандали, — славится неописуемый Гаура-Луна!</w:t>
       </w:r>
     </w:p>
     <w:p>
@@ -1431,10 +2259,42 @@
           <w:b/>
           <w:i w:val="0"/>
         </w:rPr>
-        <w:t>58.</w:t>
-      </w:r>
-      <w:r>
-        <w:t xml:space="preserve"> Если кто-то бхакти к Мурари — слушанием, размышлением, воспеванием и прочим — достигает высшей цели человека, — благо ему. А мне достойна поклонения неописуемая тайна расы того, чья обитель — Гаура</w:t>
+        <w:t>100.</w:t>
+      </w:r>
+      <w:r>
+        <w:t xml:space="preserve"> По красоте — миллионы Камадев, в радовании всех людей — миллионы лун, в нежности — миллионы матерей, в сути щедрости — миллионы райских деревьев, в глубине — миллионы океанов, в сладости — миллионы нектаров, молока и мёда; на поприще расы любви он явил миллионы чудес. Да славится Бог Гаура!</w:t>
+      </w:r>
+    </w:p>
+    <w:p>
+      <w:pPr>
+        <w:spacing w:after="60"/>
+        <w:ind w:left="510" w:hanging="510"/>
+      </w:pPr>
+      <w:r>
+        <w:rPr>
+          <w:b/>
+          <w:i w:val="0"/>
+        </w:rPr>
+        <w:t>101.</w:t>
+      </w:r>
+      <w:r>
+        <w:t xml:space="preserve"> Да славится Господь Гаура, явивший высшее дивное величие тех, кто держится садханы, ведущей к несравненной волне любви к его лотосным стопам, и кто в неистовстве великой любви неописуемо пляшет, словно безумный, приводя в великое изумление даже Шиву, Брахму и других.</w:t>
+      </w:r>
+    </w:p>
+    <w:p>
+      <w:pPr>
+        <w:spacing w:after="60"/>
+        <w:ind w:left="510" w:hanging="510"/>
+      </w:pPr>
+      <w:r>
+        <w:rPr>
+          <w:b/>
+          <w:i w:val="0"/>
+        </w:rPr>
+        <w:t>102.</w:t>
+      </w:r>
+      <w:r>
+        <w:t xml:space="preserve"> Его рёв — как рёв миллионов опьянённых царей зверей, сияние — как у миллионов солнц, прохлада — сильнее, чем у миллионов лун, походкой он превосходит миллионы обезумевших слонов; именем своим он искупает миллионы несчастных, он владыка миллионов Брахм и прочих, венец миллионов адвайтистов</w:t>
       </w:r>
       <w:r>
         <w:rPr>
@@ -1445,7 +2305,7 @@
         <w:t>1</w:t>
       </w:r>
       <w:r>
-        <w:t>, океана нектара любви, не знающего берегов.</w:t>
+        <w:t xml:space="preserve"> — славится Шри Шри Шачинандана!</w:t>
       </w:r>
     </w:p>
     <w:p>
@@ -1458,10 +2318,10 @@
           <w:b/>
           <w:i w:val="0"/>
         </w:rPr>
-        <w:t>59.</w:t>
-      </w:r>
-      <w:r>
-        <w:t xml:space="preserve"> Пусть одни поклоняются, надеясь на четыре цели человека, пусть другие, оставив всё это, станут слугами Хари. Мой же ум прельщён некой сокровенной ступенью, и я принимаю прибежище стоп Чайтаньи-Луны.</w:t>
+        <w:t>103.</w:t>
+      </w:r>
+      <w:r>
+        <w:t xml:space="preserve"> Путь, недоступный мирскому разуму и лишённый внешнего блеска, — увы, заросший здесь могучими шипами и потому труднопроходимый, вводящий в заблуждение ложными смыслами, но тотчас источающий блаженство, полное расы, — этот путь он сразу озаряет, явив его величие; полный нежности, он изгоняет тьму из пещеры сердца — славится этот неописуемый сияющий светильник Навадвипы.</w:t>
       </w:r>
     </w:p>
     <w:p>
@@ -1474,10 +2334,10 @@
           <w:b/>
           <w:i w:val="0"/>
         </w:rPr>
-        <w:t>60.</w:t>
-      </w:r>
-      <w:r>
-        <w:t xml:space="preserve"> Привязанность к мирским и ведическим делам, которой я достиг; стыдливость перед смехом, громким пением и танцем на празднике; то, что было мне от природы, — жизнь, тело, богатство и дхарма, — увы! всё это похитил некий вор — Гаура, чья сила неодолима.</w:t>
+        <w:t>104.</w:t>
+      </w:r>
+      <w:r>
+        <w:t xml:space="preserve"> Издали сжигая мотыльков ложной логики, прохладный, как миллионы лун, обитель ростков света, высшая сладость, изгоняющий внешнюю и внутреннюю тьму; его божественный свет разливается от фитиля сердца, пропитанного маслом любви; сияющий золотом — по милости здесь ярко горит этот дивный светильник Навадвипы.</w:t>
       </w:r>
     </w:p>
     <w:p>
@@ -1490,10 +2350,10 @@
           <w:b/>
           <w:i w:val="0"/>
         </w:rPr>
-        <w:t>61.</w:t>
-      </w:r>
-      <w:r>
-        <w:t xml:space="preserve"> Изливая миллионы океанов нектара любви, сотканной из густой и сияющей расы блаженства, неописуемым уголком глаз, увлажнённых состраданием, — кто этот Бог, чьё стройное золотое тело подобно сердцевине золотого бананового дерева, что внезапно накрепко привязал мой ум к своим стопам?</w:t>
+        <w:t>105.</w:t>
+      </w:r>
+      <w:r>
+        <w:t xml:space="preserve"> Криками оглашая все стороны света, волнами раскатистого смеха делая небо белым, словно от распустившихся жасминов и кувшинок, всем телом дрожа, как листья ашваттхи на ветру, опьянённый, с поступью, захлёстнутой хмелем расы любви, — сияет Гаура-Хари.</w:t>
       </w:r>
     </w:p>
     <w:p>
@@ -1506,10 +2366,10 @@
           <w:b/>
           <w:i w:val="0"/>
         </w:rPr>
-        <w:t>62.</w:t>
-      </w:r>
-      <w:r>
-        <w:t xml:space="preserve"> Там, где по милости явился сам Бог, золотой, как расплавленное золото, чьё тело — сияющая раса великой любви и блаженства, — в Навадвипе, где в каждом доме праздник бхакти, — в этой сладкой обители мой ум находит радость больше, чем на Вайкунтхе.</w:t>
+        <w:t>106.</w:t>
+      </w:r>
+      <w:r>
+        <w:t xml:space="preserve"> Без изъяна (не знающий ночи), прекрасно танцующий, вовсе свободный от нечистоты и кривизны, изливающий нектар великой любви, что снимает три страдания всех без остатка живых существ; поднявшийся из молочного океана лона Шачи, прекрасного от восхода счастья; сладость его лучей вкушают птицы-чакоры — сердца преданных: сияет неописуемая луна Гауранга.</w:t>
       </w:r>
     </w:p>
     <w:p>
@@ -1522,10 +2382,10 @@
           <w:b/>
           <w:i w:val="0"/>
         </w:rPr>
-        <w:t>63.</w:t>
-      </w:r>
-      <w:r>
-        <w:t xml:space="preserve"> Пусть шастры говорят что угодно, пусть логики толкуют как угодно, — моя жизнь лишь в нектаре лотосных стоп Чайтаньи.</w:t>
+        <w:t>107.</w:t>
+      </w:r>
+      <w:r>
+        <w:t xml:space="preserve"> Снова и снова орошая бледные щёки слезами глаз, раз за разом испуская — о! — долгие вздохи, громко рыдая, издавая жалобные-жалобные крики «Ха! Ха!», — сияет неописуемый Гаура, погружённый в чувство разлучённой девушки Враджа.</w:t>
       </w:r>
     </w:p>
     <w:p>
@@ -1538,10 +2398,18 @@
           <w:b/>
           <w:i w:val="0"/>
         </w:rPr>
-        <w:t>64.</w:t>
-      </w:r>
-      <w:r>
-        <w:t xml:space="preserve"> Пусть мне в ладонь сами упадут труднодостижимые сиддхи, пусть сами боги придут, чтобы стать моими слугами, пусть, наконец, у меня окажется четырёхрукое тело, — мой ум и на миг не отклонится от Гаурачандры.</w:t>
+        <w:t>108.</w:t>
+      </w:r>
+      <w:r>
+        <w:t xml:space="preserve"> Нося неописуемый цвет — суть золота, очищенного в огне, — то являясь резвым мальчиком-пастушком, то принимая неописуемый дивный облик и порою являя те или иные дивные игры, — сияет Гауранга-Луна, воочию — тело Радхи и Мадхурипу (Кришны).</w:t>
+      </w:r>
+    </w:p>
+    <w:p>
+      <w:pPr>
+        <w:pStyle w:val="Heading2"/>
+      </w:pPr>
+      <w:r>
+        <w:t>Величие воплощения (аватара-махима)</w:t>
       </w:r>
     </w:p>
     <w:p>
@@ -1554,10 +2422,10 @@
           <w:b/>
           <w:i w:val="0"/>
         </w:rPr>
-        <w:t>65.</w:t>
-      </w:r>
-      <w:r>
-        <w:t xml:space="preserve"> Лучше мне жить в клетке из языков страшного пламени, чем где-либо общаться с теми, кто отвернулся от лотосных стоп Шри Чайтаньи. Даже если сама собой придёт обитель Вайкунтхи и прочее, мой ум не пожелает её, если не вкусит хоть немного блеска пыли с лотосных стоп Гауры.</w:t>
+        <w:t>109.</w:t>
+      </w:r>
+      <w:r>
+        <w:t xml:space="preserve"> Неожиданно приходит волна Имени Господа к воплощённым существам, окружённым даже тяжкими грехами; о! — даже сердца людей, подобные алмазу, стали как свежее масло, — когда он нисходит в мир. Этот Гаура — моё прибежище.</w:t>
       </w:r>
     </w:p>
     <w:p>
@@ -1570,10 +2438,10 @@
           <w:b/>
           <w:i w:val="0"/>
         </w:rPr>
-        <w:t>66.</w:t>
-      </w:r>
-      <w:r>
-        <w:t xml:space="preserve"> Пусть по всей земле идёт молва: «Он велик, велик!» Пусть миру явится великая дивная сиддхи. Пусть, поклоняясь Владыке вселенной, обрету прекрасный четырёхрукий облик. Нет, нет — без бхакти к Шри Гауре мой ум ничего этого не ценит!</w:t>
+        <w:t>110.</w:t>
+      </w:r>
+      <w:r>
+        <w:t xml:space="preserve"> Нет ни йоги, ни медитации, ни джапы, ни подвижничества, ни отречения, ни обетов, ни Вед, ни благочестия, — где уж там отказ от запретного! — и всё же, когда нисходит Чайтанья, чьё сердце — сама суть сострадания, люди здесь с радостью неожиданно похищают высший венец целей человека.</w:t>
       </w:r>
     </w:p>
     <w:p>
@@ -1586,10 +2454,10 @@
           <w:b/>
           <w:i w:val="0"/>
         </w:rPr>
-        <w:t>67.</w:t>
-      </w:r>
-      <w:r>
-        <w:t xml:space="preserve"> «Чайтанья! Милостивый! Высший щедрец! Ты, наполнивший сердца всех существ любовью разных видов! Обитель чудес! Гауранга! Океан достоинств! Воплощение расы! Ты, любящий свои имена!» — молю, чтобы так, неустанно повторяя, я провёл эту жизнь.</w:t>
+        <w:t>111.</w:t>
+      </w:r>
+      <w:r>
+        <w:t xml:space="preserve"> Когда на земле нисходит Шри Чайтанья, дивный своим богатством, — ум, упавший в поток великой кармы, обретает устойчивость; ум, твёрже великих камней, становится текучим; даже ум великих йогов, оставив свою садхану, пляшет в вышине.</w:t>
       </w:r>
     </w:p>
     <w:p>
@@ -1602,10 +2470,10 @@
           <w:b/>
           <w:i w:val="0"/>
         </w:rPr>
-        <w:t>68.</w:t>
-      </w:r>
-      <w:r>
-        <w:t xml:space="preserve"> О Шаури! Когда возникнет у меня бесхитростное чувство к твоему телу Гауры, дарующему расу высшей любви, — к единственной жизни святых? Или когда через неземное постижение его в моём сердце внезапно взойдёт сияние драгоценных ногтей на стопах Шри Радхи?</w:t>
+        <w:t>112.</w:t>
+      </w:r>
+      <w:r>
+        <w:t xml:space="preserve"> Когда Чайтанья-Луна явил высший путь бхакти-йоги, мирские люди оставили разговоры о жене, сыновьях и прочем, учёные — споры о шастрах, владыки йогов — мучения обуздания дыхания, подвижники — подвижничество, санньясины — изучение знания. Никакой иной расы не осталось.</w:t>
       </w:r>
     </w:p>
     <w:p>
@@ -1618,10 +2486,10 @@
           <w:b/>
           <w:i w:val="0"/>
         </w:rPr>
-        <w:t>69.</w:t>
-      </w:r>
-      <w:r>
-        <w:t xml:space="preserve"> Пленительного пышными гирляндами из дамнаки, радость садов, непрестанно повторяющего Имя, обитель милосердия, обитель золотого сияния Гауры, — высшую обитель по имени Чайтанья мы созерцаем.</w:t>
+        <w:t>113.</w:t>
+      </w:r>
+      <w:r>
+        <w:t xml:space="preserve"> Когда в мир нисходит Гаура, в каждом доме гремит санкиртана Хари, в каждом теле сияет обилие трепета и слёз, и в каждой привязанности — ступень высшего сладостного превосходства, далёкая даже от Вед.</w:t>
       </w:r>
     </w:p>
     <w:p>
@@ -1634,21 +2502,10 @@
           <w:b/>
           <w:i w:val="0"/>
         </w:rPr>
-        <w:t>70.</w:t>
-      </w:r>
-      <w:r>
-        <w:t xml:space="preserve"> Пусть мой ум, свободный от привязанностей, помнит Гаурангу, что всегда в радости на вершине Ниладри; глаза его — пчёлы на сияющем лотосе лица Хари</w:t>
-      </w:r>
-      <w:r>
-        <w:rPr>
-          <w:b w:val="0"/>
-          <w:i w:val="0"/>
-          <w:vertAlign w:val="superscript"/>
-        </w:rPr>
-        <w:t>2</w:t>
-      </w:r>
-      <w:r>
-        <w:t>; он — высокая волна опьяняющей расы любви ланеоких; он — Ананга (бесплотный Камадева).</w:t>
+        <w:t>114.</w:t>
+      </w:r>
+      <w:r>
+        <w:t xml:space="preserve"> Неожиданно весь этот мир затопили неописуемые потоки расы из океана великой любви; неожиданно изумление охватило людей — от невиданных и неслыханных прежде преображений, — когда нисходит Кришна в теле, прекрасном золотым сиянием.</w:t>
       </w:r>
     </w:p>
     <w:p>
@@ -1661,10 +2518,10 @@
           <w:b/>
           <w:i w:val="0"/>
         </w:rPr>
-        <w:t>71.</w:t>
-      </w:r>
-      <w:r>
-        <w:t xml:space="preserve"> Его тело украшают капли слёз, струящиеся из лотосных глаз, прелестные, как лучшие жемчужины; высшую его красоту составляет и вставший на теле трепет. Прибегаю к Гауре — Хари, носящему одежду цвета алой зари.</w:t>
+        <w:t>115.</w:t>
+      </w:r>
+      <w:r>
+        <w:t xml:space="preserve"> Прежде одни, неудержимо возгордившись, хватались повсюду за все шастры; другие, мнящие себя счастливцами, держались обрядов, подвижничества и прочих правил; некоторые же, с превратным намерением, повторяли два-три имени Хари. А теперь, когда взошёл Гаурачандра, даже према стала обычной.</w:t>
       </w:r>
     </w:p>
     <w:p>
@@ -1677,10 +2534,10 @@
           <w:b/>
           <w:i w:val="0"/>
         </w:rPr>
-        <w:t>72.</w:t>
-      </w:r>
-      <w:r>
-        <w:t xml:space="preserve"> Прекраснее Кандарпы, — о! — чище потоков небесной реки, прохладнее луны, слаще лучшего мёда, щедрее древа желаний, нежнее матери в своей любви, — когда же Гаурахари, о котором я размышляю, ступит в моё сердце?</w:t>
+        <w:t>116.</w:t>
+      </w:r>
+      <w:r>
+        <w:t xml:space="preserve"> Когда снизошёл Бог по имени Чайтанья, о служении лотосным стопам которого молят боги, — и простёр по вселенной сладчайшие волны нектара любви, — кто ребёнок, кто старик, кто тупица, кто женщина, кто ничтожество? У всех, кто предан стопам Хари, возникло неописуемое единство вкуса.</w:t>
       </w:r>
     </w:p>
     <w:p>
@@ -1693,10 +2550,10 @@
           <w:b/>
           <w:i w:val="0"/>
         </w:rPr>
-        <w:t>73.</w:t>
-      </w:r>
-      <w:r>
-        <w:t xml:space="preserve"> Раз за разом даруя груды сладчайшего хмельного мёда любви, сам безмерно милостивый, радуя этот мир, — единственный Бог, на чьих бёдрах прелестная одежда цвета марены, чьё сияние посрамляет миллионы новых молний, — он один мне дорог.</w:t>
+        <w:t>117.</w:t>
+      </w:r>
+      <w:r>
+        <w:t xml:space="preserve"> Сюда пришли все — Шанкара, Нарада и другие; явилась сама Шри (Лакшми); соединился с ним и бог Халаюдха (Баларама); родились и те самые Вришни; более того — явились и жители Враджа: пастушки, гопи и другие, — когда на землю сошёл Шри Гаурачандра, владыка расы полной любви.</w:t>
       </w:r>
     </w:p>
     <w:p>
@@ -1709,10 +2566,10 @@
           <w:b/>
           <w:i w:val="0"/>
         </w:rPr>
-        <w:t>74.</w:t>
-      </w:r>
-      <w:r>
-        <w:t xml:space="preserve"> Его красота посрамляет миллионы миллионов Маданов, сияние его прекрасного лица-луны затмевает свет миллионов миллионов восходящих осенних лун, щедростью он умаляет древо желаний, умноженное миллионы миллионов раз, — благодаря удаче миллионов миллионов рождений Гаура ступит в моё сердце.</w:t>
+        <w:t>118.</w:t>
+      </w:r>
+      <w:r>
+        <w:t xml:space="preserve"> Слуги, друзья и те, кто причастен сладчайшей, сияющей и щедрой [расе], — все они нисошли рядом с его двумя лотосными стопами. Когда золотой Гаура раздаёт миру свою дивную любовь, они обрели богатство нектара великой любви большее, чем прежде.</w:t>
       </w:r>
     </w:p>
     <w:p>
@@ -1725,10 +2582,10 @@
           <w:b/>
           <w:i w:val="0"/>
         </w:rPr>
-        <w:t>75.</w:t>
-      </w:r>
-      <w:r>
-        <w:t xml:space="preserve"> То исхудавший, то полный, — ах! — то в слезах, то улыбающийся, то холодный, то пылающий, будто от огня, то бегущий, то оцепеневший, то говорящий без умолку, — о! — то немой — да явится в моём сердце Гаура, тело Господа.</w:t>
+        <w:t>119.</w:t>
+      </w:r>
+      <w:r>
+        <w:t xml:space="preserve"> Когда на землю сошёл Шри Чайтанья, суть дивного величия, — ах! — даже благородные жёны вокруг громко-громко смеются; даже сердца, сложенные из камней дурных чувственных привязанностей, становятся текучими; даже невежды посрамляют собрание знатоков всех шастр.</w:t>
       </w:r>
     </w:p>
     <w:p>
@@ -1741,10 +2598,10 @@
           <w:b/>
           <w:i w:val="0"/>
         </w:rPr>
-        <w:t>76.</w:t>
-      </w:r>
-      <w:r>
-        <w:t xml:space="preserve"> Господь не разбирает, достоин ли человек или недостоин, не смотрит, свой он или чужой, не взвешивает, что можно дать и чего нельзя, не ждёт подходящего времени. Тот, кто тотчас дарует расу бхакти, труднодостижимую слушанием, созерцанием, поклонами, медитацией и прочим, — этот Господь Гаура — моё высшее прибежище.</w:t>
+        <w:t>120.</w:t>
+      </w:r>
+      <w:r>
+        <w:t xml:space="preserve"> Прежде даже у всезнающих почти не было разумения: их скудный, косный рассудок не ступал на суть всех целей. Но теперь, когда по милости в мир нисшёл Гаурачандра, — кто не вошёл в бхакти сладостной любви, в сияющую расу глубоких и щедрых чувств?</w:t>
       </w:r>
     </w:p>
     <w:p>
@@ -1757,10 +2614,10 @@
           <w:b/>
           <w:i w:val="0"/>
         </w:rPr>
-        <w:t>77.</w:t>
-      </w:r>
-      <w:r>
-        <w:t xml:space="preserve"> Будь человек величайшим грешником, низкорождённым, порочным, пределом дурных дел, хуже собакоеда, вечно полным дурных наклонностей, рождённым в дурной стране и живущим там, погибшим от дурного общества, — он всё равно был по милости спасён. Прибегаю лишь к этому Гауре.</w:t>
+        <w:t>121.</w:t>
+      </w:r>
+      <w:r>
+        <w:t xml:space="preserve"> Высший смысл «Шримад-Бхагаватам», который Шри Вайясаки (Шука) запечатлел даже в рассказе о раса — так, что трудно уловить связь; то, что есть единственное истинное вместилище вкуса расы галантного героя игр любви Радхи, — чтобы распространить это сокровище, Хари нисшёл в мир в облике Гауры.</w:t>
       </w:r>
     </w:p>
     <w:p>
@@ -1773,18 +2630,10 @@
           <w:b/>
           <w:i w:val="0"/>
         </w:rPr>
-        <w:t>78.</w:t>
-      </w:r>
-      <w:r>
-        <w:t xml:space="preserve"> Оставив сияющий Вриндаван на берегу дочери Калинды (Ямуны), он ушёл в цветущие сады на берегу солёного океана; надел одеяние цвета зари, отбросив прекрасное жёлтое; скрыв собственный облик, явил золотистость. Этот Хари — моё прибежище.</w:t>
-      </w:r>
-    </w:p>
-    <w:p>
-      <w:pPr>
-        <w:pStyle w:val="Heading2"/>
-      </w:pPr>
-      <w:r>
-        <w:t>Наставление миру (лока-шикша)</w:t>
+        <w:t>122.</w:t>
+      </w:r>
+      <w:r>
+        <w:t xml:space="preserve"> Одни — Уддхава и другие — обрели служение; другие обрели достойное хвалы положение Шридамы и прочих друзей; третьи обрели чувство лотосооких девушек Враджа; а иные, счастливейшие и мудрые, пьют [нектар] лотосных стоп Радхи. Каких только богатств не досталось миру по милости Шри Чайтаньи Махапрабху!</w:t>
       </w:r>
     </w:p>
     <w:p>
@@ -1797,10 +2646,10 @@
           <w:b/>
           <w:i w:val="0"/>
         </w:rPr>
-        <w:t>79.</w:t>
-      </w:r>
-      <w:r>
-        <w:t xml:space="preserve"> Эй, глупцы! Ищите сокровенный путь преданности Хари, неведомый прежде лучшим мудрецам даже при их далеко видящем взоре. А если в сердце нет веры или он кажется недостижимым — оставьте всё и примите прибежище стоп Гауры.</w:t>
+        <w:t>123.</w:t>
+      </w:r>
+      <w:r>
+        <w:t xml:space="preserve"> Прежде всезнающие лучшие мудрецы доводами распространили каждый своё учение, и ни один человек не был твёрдо уверен ни в одном из них. А теперь, когда взошёл Гауранга-Луна несравненной силы, — кто вновь не убедился, что высший смысл шрути — лишь преданность Хари?</w:t>
       </w:r>
     </w:p>
     <w:p>
@@ -1813,10 +2662,10 @@
           <w:b/>
           <w:i w:val="0"/>
         </w:rPr>
-        <w:t>80.</w:t>
-      </w:r>
-      <w:r>
-        <w:t xml:space="preserve"> Он держит на голове сложенные лотосы ладоней, словно бутон; его нежные щёки омыты струящимися слезами; одет он в ткань цвета тычинок свежего лотоса. Поклоняйтесь этому высшему свету — Гауре, похитителю золотого сияния!</w:t>
+        <w:t>124.</w:t>
+      </w:r>
+      <w:r>
+        <w:t xml:space="preserve"> Я вспоминаю некое дивное могущество блеска лунных камней — ногтей Гауранги-Луны, которое погружает весь мир в несравненный океан превосходного нектара расы великой любви.</w:t>
       </w:r>
     </w:p>
     <w:p>
@@ -1829,10 +2678,10 @@
           <w:b/>
           <w:i w:val="0"/>
         </w:rPr>
-        <w:t>81.</w:t>
-      </w:r>
-      <w:r>
-        <w:t xml:space="preserve"> Повторяй имя владыки Гокулы, неистовую череду имён; созерцай его божественный, сладкий облик, несущий благо миру, — но, увы, даже надежды на ступень, трепещущую великой расой любви, у тебя не будет, если не падёт на тебя милостивый взгляд Шри Чайтаньи Махапрабху.</w:t>
+        <w:t>125.</w:t>
+      </w:r>
+      <w:r>
+        <w:t xml:space="preserve"> Прежние [великие], исполненные высших заслуг и благочестия, приводили к цели разве что одного-другого. Но так, чтобы весь мир был погружён в океан любви, — не делал никто.</w:t>
       </w:r>
     </w:p>
     <w:p>
@@ -1845,10 +2694,10 @@
           <w:b/>
           <w:i w:val="0"/>
         </w:rPr>
-        <w:t>82.</w:t>
-      </w:r>
-      <w:r>
-        <w:t xml:space="preserve"> Эй, не дерзай! Над всеми твоими усилиями вокруг смеются люди, опьянённые вкусом нектара Хари-расы. Выслушай сказанное: здесь разъясняется предмет любви — то, что в Ведах; и его владыка — именно Гаура, высший.</w:t>
+        <w:t>126.</w:t>
+      </w:r>
+      <w:r>
+        <w:t xml:space="preserve"> Даже имеющий несравненную верность дхарме и величайшую преданность Вишну, бывает, живёт здесь с сердцем, твёрдым словно железо; а тот, кто ниже убийцы коровы, — о! — затопляет мир потоками слёз. Ах, кто постигнет глубокую игру золотого Гауранги?</w:t>
       </w:r>
     </w:p>
     <w:p>
@@ -1861,10 +2710,10 @@
           <w:b/>
           <w:i w:val="0"/>
         </w:rPr>
-        <w:t>83.</w:t>
-      </w:r>
-      <w:r>
-        <w:t xml:space="preserve"> «Мне не по вкусу путь знания и прочее; пути преданности владыке Враджа я не знаю; истинные гуру мне не встречаются; увы, увы, кто мне прибежище?» — О глупец! Неужто Гаура-Хари так и не достиг твоих ушей?</w:t>
+        <w:t>127.</w:t>
+      </w:r>
+      <w:r>
+        <w:t xml:space="preserve"> Порою, охваченный Кришной, он пляшет, изображая множество поз; порою, охваченный Радхой, с плачем в муке восклицает: «Хари! Хари! Хари!»; порою ползает, как младенец; порою ведёт себя как пастушок. Так глубоко великий Гаура изумляет мир.</w:t>
       </w:r>
     </w:p>
     <w:p>
@@ -1877,10 +2726,10 @@
           <w:b/>
           <w:i w:val="0"/>
         </w:rPr>
-        <w:t>84.</w:t>
-      </w:r>
-      <w:r>
-        <w:t xml:space="preserve"> Оставьте напрасную увлечённость обрядами, не подпускайте к ушам даже разговоров о пути созерцания Атмана, не предавайтесь заблуждению о теле и прочем — и по милости Гауры к вам придёт венец целей человека, высшим образом дивный и сладкий.</w:t>
+        <w:t>128.</w:t>
+      </w:r>
+      <w:r>
+        <w:t xml:space="preserve"> На берегу солёного океана погружающий мир в игры, где сияет суть того чувства, что юная пастушка (Радха) питает к сладости Кришны — сокровищницы её расы; уже в детских забавах своим сиянием единственный чаровник вселенной, — мне мил неописуемый облик, словно сотканный из расплавленного золота.</w:t>
       </w:r>
     </w:p>
     <w:p>
@@ -1893,21 +2742,18 @@
           <w:b/>
           <w:i w:val="0"/>
         </w:rPr>
-        <w:t>85.</w:t>
-      </w:r>
-      <w:r>
-        <w:t xml:space="preserve"> Довольно изучения шастр! Довольно, ах, паломничеств! Оставьте всё ложное, плюньте на небеса! Счастливцы, ставящие всё это ни во что, примите прибежище Гауранги, принявшего личину санньясина, — он пляшет на берегу океана, опьянённый собственной расой</w:t>
-      </w:r>
-      <w:r>
-        <w:rPr>
-          <w:b w:val="0"/>
-          <w:i w:val="0"/>
-          <w:vertAlign w:val="superscript"/>
-        </w:rPr>
-        <w:t>3</w:t>
-      </w:r>
-      <w:r>
-        <w:t>.</w:t>
+        <w:t>129.</w:t>
+      </w:r>
+      <w:r>
+        <w:t xml:space="preserve"> Кто прежде слышал о дивном предмете, называемом према? Кто знал величие Имён? Кто входил в великую сладость лесов Вриндаваны? Кто знал Радху — предел сладости и чуда высшей расы? Один лишь Чайтанья-Луна по высшей милости открыл всё это.</w:t>
+      </w:r>
+    </w:p>
+    <w:p>
+      <w:pPr>
+        <w:pStyle w:val="Heading2"/>
+      </w:pPr>
+      <w:r>
+        <w:t>Красота и танец Гауры</w:t>
       </w:r>
     </w:p>
     <w:p>
@@ -1920,10 +2766,10 @@
           <w:b/>
           <w:i w:val="0"/>
         </w:rPr>
-        <w:t>86.</w:t>
-      </w:r>
-      <w:r>
-        <w:t xml:space="preserve"> К чему, увы, бесплодно утруждать себя на труднопроходимых путях йоги и прочих? Посвятив бхакти лотосным стопам Кришны, вы обретёте все цели. А если есть надежда на дивный великий праздник любви, недоступный Шиве, Брахме и другим, — тогда отдайтесь Гауре, обители, чьё щедрое величие непостижимо.</w:t>
+        <w:t>130.</w:t>
+      </w:r>
+      <w:r>
+        <w:t xml:space="preserve"> Он покрывает вселенную миллионами отсветов золотого сияния тела, колышущегося на волнах океана нектара расы полной любви; ему воздают хвалу Владыка (Шива), Творец (Брахма), Вьяса и другие; явив пленяющий мир облик, едва различимый миллионами шрути, — о чудо! — на берегу солёного океана пляшет сам Высший Брахман.</w:t>
       </w:r>
     </w:p>
     <w:p>
@@ -1936,10 +2782,10 @@
           <w:b/>
           <w:i w:val="0"/>
         </w:rPr>
-        <w:t>87.</w:t>
-      </w:r>
-      <w:r>
-        <w:t xml:space="preserve"> По мере того как совершивший груды благих дел обретает бхакти к лотосным стопам Гауры, в его сердце внезапно вздымается океан нектара лотосных стоп Радхи.</w:t>
+        <w:t>131.</w:t>
+      </w:r>
+      <w:r>
+        <w:t xml:space="preserve"> Кто этот лучший из галантных героев — Гаура? Его бёдра украшены шёлковой тканью, на руке браслет, на груди ожерелье, в ушах серьги, на ногах ножные колокольчики; он поднял и связал пышные кудри, увенчав их гирляндой из распустившегося жасмина, — он играет, танцуя под свои же имена.</w:t>
       </w:r>
     </w:p>
     <w:p>
@@ -1952,10 +2798,10 @@
           <w:b/>
           <w:i w:val="0"/>
         </w:rPr>
-        <w:t>88.</w:t>
-      </w:r>
-      <w:r>
-        <w:t xml:space="preserve"> Стопы Чайтаньи, которым поклоняются Брахма и Шива, — хранилище безбрежного океана нектара тайны расы, сияющей любовью. Поэтому пусть мудрые, созерцая их, в избытке любви ищут у них прибежища, и, обезумев, лишь о них здесь поют.</w:t>
+        <w:t>132.</w:t>
+      </w:r>
+      <w:r>
+        <w:t xml:space="preserve"> Когда Шри Гаурачандра, обезумевший от собственной любви, исполнял на земле неистовый танец, боги били в литавры, лучшие из гандхарвов пели, сиддхи непрерывным дождём цветов покрыли эту землю, а сонмы великих риши с любовью предстали, вознося дивные хвалы.</w:t>
       </w:r>
     </w:p>
     <w:p>
@@ -1968,10 +2814,10 @@
           <w:b/>
           <w:i w:val="0"/>
         </w:rPr>
-        <w:t>89.</w:t>
-      </w:r>
-      <w:r>
-        <w:t xml:space="preserve"> Взяв в зубы травинку, падая к ногам, сотней жалобных мольб я говорю вот что: «О святые! Оставьте всё далеко позади и возлюбите стопы Гауранги-Луны!»</w:t>
+        <w:t>133.</w:t>
+      </w:r>
+      <w:r>
+        <w:t xml:space="preserve"> Он то смеётся, то плачет, то лишается чувств, то катается по земле, то бежит, то пляшет, то вздыхает, то издаёт громкие крики «Ха! Ха!» — опьянённый хмелем великой любви, здесь играет Гаура-Хари.</w:t>
       </w:r>
     </w:p>
     <w:p>
@@ -1984,10 +2830,10 @@
           <w:b/>
           <w:i w:val="0"/>
         </w:rPr>
-        <w:t>90.</w:t>
-      </w:r>
-      <w:r>
-        <w:t xml:space="preserve"> О! Освобождение не трудно обрести, и бхакти не так уж трудно; но милость Гаурачандры труднодостижима даже на Вайкунтхе.</w:t>
+        <w:t>134.</w:t>
+      </w:r>
+      <w:r>
+        <w:t xml:space="preserve"> Неописуемыми потоками слёз делая землю перед собой грязью, подперев ладонью щёку, бледную, как плод бадари, живя на берегу солёного океана и нося дивную алую одежду, — сам Хари, став золотым, распространяет любовь к лотосным стопам Радхи.</w:t>
       </w:r>
     </w:p>
     <w:p>
@@ -2000,10 +2846,18 @@
           <w:b/>
           <w:i w:val="0"/>
         </w:rPr>
-        <w:t>91.</w:t>
-      </w:r>
-      <w:r>
-        <w:t xml:space="preserve"> Поклоняйтесь лотосным стопам Чайтаньи, исполнитесь расой истинной бхакти и радуйте три мира разнообразной сладостью, удачей, состраданием, терпением и прочим.</w:t>
+        <w:t>135.</w:t>
+      </w:r>
+      <w:r>
+        <w:t xml:space="preserve"> Топотом ног оглашая стороны света, каплями слёз превращая землю в грязь, — о! — раскатами смеха делая небо светлым, сияющий, как луна, в алом одеянии, колышущемся на прекрасных, изящных бёдрах, — что за Бог радостно пляшет в цветущем саду на берегу солёного океана?</w:t>
+      </w:r>
+    </w:p>
+    <w:p>
+      <w:pPr>
+        <w:pStyle w:val="Heading2"/>
+      </w:pPr>
+      <w:r>
+        <w:t>Скорбь (шочака)</w:t>
       </w:r>
     </w:p>
     <w:p>
@@ -2016,10 +2870,10 @@
           <w:b/>
           <w:i w:val="0"/>
         </w:rPr>
-        <w:t>92.</w:t>
-      </w:r>
-      <w:r>
-        <w:t xml:space="preserve"> Если сердце стремится переплыть океан мирского бытия, если ум радуется нектарной расе санкиртаны, если мысль желает играть в океане любви, — пусть принимает прибежище стоп Чайтаньи-Луны.</w:t>
+        <w:t>136.</w:t>
+      </w:r>
+      <w:r>
+        <w:t xml:space="preserve"> Его природу не могут разглядеть даже венцы всех Вед; неописуемо прекрасен его сладчайший путь, недоступный даже Лакшми, Шиве, Брахме и другим; он внезапно опьянил этот мир вином расы Шри Радхи и Хари, — разве этот Шри Чайтанья-Луна доступен моим словам или уму?</w:t>
       </w:r>
     </w:p>
     <w:p>
@@ -2032,18 +2886,10 @@
           <w:b/>
           <w:i w:val="0"/>
         </w:rPr>
-        <w:t>93.</w:t>
-      </w:r>
-      <w:r>
-        <w:t xml:space="preserve"> Пусть знание, отречение, бхакти и прочее совершают как угодно, — но где то, что сравнится с достигаемым бхакти к лотосным стопам Чайтаньи?</w:t>
-      </w:r>
-      <w:r>
-        <w:rPr>
-          <w:b w:val="0"/>
-          <w:i w:val="0"/>
-          <w:vertAlign w:val="superscript"/>
-        </w:rPr>
-        <w:t>4</w:t>
+        <w:t>137.</w:t>
+      </w:r>
+      <w:r>
+        <w:t xml:space="preserve"> Где-то — косность в обрядах, где-то — джапа, подвижничество, йога и прочее, где-то — обрядовое поклонение Говинде, где-то — гордость знанием; а святая бхакти Хари, хоть и сияющая, где-то осталась лишь на словах. Ах, Чайтанья, куда ты ушёл? Твоего пути нигде не видно!</w:t>
       </w:r>
     </w:p>
     <w:p>
@@ -2056,10 +2902,10 @@
           <w:b/>
           <w:i w:val="0"/>
         </w:rPr>
-        <w:t>94.</w:t>
-      </w:r>
-      <w:r>
-        <w:t xml:space="preserve"> Если этот мир не поклоняется Чайтанье — Владыке, которому поклоняются лучшие из богов, — он лишён сознания (а-чайтанья), и всюду его ждёт смерть.</w:t>
+        <w:t>138.</w:t>
+      </w:r>
+      <w:r>
+        <w:t xml:space="preserve"> Когда явился Хари, золотой, как расплавленное золото, его же величием мир погрузился в расу любви, и повсюду громко-громко гремела санкиртана Хари, — ах, вернётся ли когда-нибудь то сладкое время?</w:t>
       </w:r>
     </w:p>
     <w:p>
@@ -2072,10 +2918,10 @@
           <w:b/>
           <w:i w:val="0"/>
         </w:rPr>
-        <w:t>95.</w:t>
-      </w:r>
-      <w:r>
-        <w:t xml:space="preserve"> У кого есть надежда на две стопы Чайтаньи Махапрабху, тому сам Индра кажется слугой, — что уж говорить о царе-черве!</w:t>
+        <w:t>139.</w:t>
+      </w:r>
+      <w:r>
+        <w:t xml:space="preserve"> Та же это благословенная столица Гауды, тот же берег океана, тот же Шри Пурушоттама (Джаганнатха), те же имена Мадхупати, — но, Хари, Хари! — такого праздника любви нигде не видно. Ах, Чайтанья, сокровищница милости, увижу ли я снова твоё величие?</w:t>
       </w:r>
     </w:p>
     <w:p>
@@ -2088,10 +2934,10 @@
           <w:b/>
           <w:i w:val="0"/>
         </w:rPr>
-        <w:t>96.</w:t>
-      </w:r>
-      <w:r>
-        <w:t xml:space="preserve"> Кто, возложив надежду на Кришну Чайтанью, станет просить у дверей царя? Какой глупец, получив чинтамани, пойдёт за серебром?</w:t>
+        <w:t>140.</w:t>
+      </w:r>
+      <w:r>
+        <w:t xml:space="preserve"> Если сказать, что Гаурачандра подобен частичным воплощениям — Рыбе и прочим, — то он не таков: ведь те — лишь проявление какой-то силы и игры. Он же, чьё величие непостижимо, явив дивные игры с несравненной полнотой всех сил, нисшёл полным [Богом].</w:t>
       </w:r>
     </w:p>
     <w:p>
@@ -2104,10 +2950,10 @@
           <w:b/>
           <w:i w:val="0"/>
         </w:rPr>
-        <w:t>97.</w:t>
-      </w:r>
-      <w:r>
-        <w:t xml:space="preserve"> Многие, созерцая в горных пещерах, пребывают в переживании Брахмана; на земле много сиддхов, преданных практике йоги; многие, возгордившись учёностью, доблестью, богатством и прочим, спорят друг с другом. Но кто в мире сегодня без милости Гауры пляшет, опьянённый любовью?</w:t>
+        <w:t>141.</w:t>
+      </w:r>
+      <w:r>
+        <w:t xml:space="preserve"> Пусть Махапрабху обладает величием, дивнее даже, чем у Изначального — источника Брахмы и Шивы, — услышав лепет несмышлёного ребёнка, он непременно будет ласков.</w:t>
       </w:r>
     </w:p>
     <w:p>
@@ -2120,10 +2966,23 @@
           <w:b/>
           <w:i w:val="0"/>
         </w:rPr>
-        <w:t>98.</w:t>
-      </w:r>
-      <w:r>
-        <w:t xml:space="preserve"> Я не ставлю ни во что и жизнь в Каши — к чему мне искать Гаю? Освобождение для меня — как перламутр, что лишь кажется серебром; какое мне дело до чужих целей? Даже в великом аде Раурава мне не мерещится и тени страха — где уж тут бояться за жену, сыновей и прочее, — если милостив ко мне Бог богов Гаура.</w:t>
+        <w:t>142.</w:t>
+      </w:r>
+      <w:r>
+        <w:t xml:space="preserve"> Я не видел шастр, не видел гуру, мудрые разумом не разбирали [моих слов], — пусть же, как бы я ни лепетал по-детски, Гаура-Хари будет милостив ко мне.</w:t>
+      </w:r>
+    </w:p>
+    <w:p>
+      <w:pPr>
+        <w:spacing w:after="60"/>
+        <w:jc w:val="both"/>
+      </w:pPr>
+      <w:r>
+        <w:rPr>
+          <w:b w:val="0"/>
+          <w:i/>
+        </w:rPr>
+        <w:t>Так завершается «Шри Шри Чайтанья-чандрамрита» в двенадцати разделах, сложенная Шрипадой Шримат Прабодханандой Сарасвати — драгоценным венцом рода госвами-тридандинов, лучшим из странствующих наставников, выдающимся спутником Гауры.</w:t>
       </w:r>
     </w:p>
     <w:p>
@@ -2143,1096 +3002,7 @@
         <w:rPr>
           <w:sz w:val="18"/>
         </w:rPr>
-        <w:t xml:space="preserve"> </w:t>
-      </w:r>
-      <w:r>
-        <w:rPr>
-          <w:b w:val="0"/>
-          <w:i/>
-          <w:sz w:val="18"/>
-        </w:rPr>
-        <w:t>Гаура-дхаман</w:t>
-      </w:r>
-      <w:r>
-        <w:rPr>
-          <w:sz w:val="18"/>
-        </w:rPr>
-        <w:t xml:space="preserve"> — «того, чья обитель (или сияние) — Гаура», т. е. Кришны в облике Гауры.</w:t>
-      </w:r>
-    </w:p>
-    <w:p>
-      <w:pPr>
-        <w:spacing w:after="60"/>
-        <w:ind w:left="283"/>
-      </w:pPr>
-      <w:r>
-        <w:rPr>
-          <w:b/>
-          <w:i w:val="0"/>
-          <w:sz w:val="18"/>
-        </w:rPr>
-        <w:t>2.</w:t>
-      </w:r>
-      <w:r>
-        <w:rPr>
-          <w:sz w:val="18"/>
-        </w:rPr>
-        <w:t xml:space="preserve"> Вершина Ниладри (Нилачалы) — Пури; «лицо Хари» — Джаганнатха, на которого неотрывно смотрит Махапрабху.</w:t>
-      </w:r>
-    </w:p>
-    <w:p>
-      <w:pPr>
-        <w:spacing w:after="60"/>
-        <w:ind w:left="283"/>
-      </w:pPr>
-      <w:r>
-        <w:rPr>
-          <w:b/>
-          <w:i w:val="0"/>
-          <w:sz w:val="18"/>
-        </w:rPr>
-        <w:t>3.</w:t>
-      </w:r>
-      <w:r>
-        <w:rPr>
-          <w:sz w:val="18"/>
-        </w:rPr>
-        <w:t xml:space="preserve"> Вторая строка шлоки распознана плохо; перевод передаёт общий смысл.</w:t>
-      </w:r>
-    </w:p>
-    <w:p>
-      <w:pPr>
-        <w:spacing w:after="60"/>
-        <w:ind w:left="283"/>
-      </w:pPr>
-      <w:r>
-        <w:rPr>
-          <w:b/>
-          <w:i w:val="0"/>
-          <w:sz w:val="18"/>
-        </w:rPr>
-        <w:t>4.</w:t>
-      </w:r>
-      <w:r>
-        <w:rPr>
-          <w:sz w:val="18"/>
-        </w:rPr>
-        <w:t xml:space="preserve"> Первая строка восстановлена по бенгальскому изданию (там № 94).</w:t>
-      </w:r>
-    </w:p>
-    <w:p>
-      <w:r>
-        <w:br w:type="page"/>
-      </w:r>
-    </w:p>
-    <w:p>
-      <w:pPr>
-        <w:pStyle w:val="Heading1"/>
-        <w:jc w:val="center"/>
-      </w:pPr>
-      <w:r>
-        <w:t>Часть 4</w:t>
-      </w:r>
-    </w:p>
-    <w:p>
-      <w:pPr>
-        <w:spacing w:after="60"/>
-        <w:jc w:val="both"/>
-      </w:pPr>
-      <w:r>
-        <w:rPr>
-          <w:b w:val="0"/>
-          <w:i/>
-        </w:rPr>
-        <w:t>Превосходство Шри Чайтаньи. Величие воплощения. Красота и танец Гауры. Скорбь (шлоки 99–142)</w:t>
-      </w:r>
-    </w:p>
-    <w:p>
-      <w:pPr>
-        <w:pStyle w:val="Heading2"/>
-      </w:pPr>
-      <w:r>
-        <w:t>Превосходство Шри Чайтаньи (уткарша)</w:t>
-      </w:r>
-    </w:p>
-    <w:p>
-      <w:pPr>
-        <w:spacing w:after="60"/>
-        <w:ind w:left="510" w:hanging="510"/>
-      </w:pPr>
-      <w:r>
-        <w:rPr>
-          <w:b/>
-          <w:i w:val="0"/>
-        </w:rPr>
-        <w:t>99.</w:t>
-      </w:r>
-      <w:r>
-        <w:t xml:space="preserve"> С отвагой молодого льва в пору гона, с усердием затопить мир океаном любви, нежный, как стебель дивного нового золотого банана, — славится неописуемый Гаура-Луна!</w:t>
-      </w:r>
-    </w:p>
-    <w:p>
-      <w:pPr>
-        <w:spacing w:after="60"/>
-        <w:ind w:left="510" w:hanging="510"/>
-      </w:pPr>
-      <w:r>
-        <w:rPr>
-          <w:b/>
-          <w:i w:val="0"/>
-        </w:rPr>
-        <w:t>100.</w:t>
-      </w:r>
-      <w:r>
-        <w:t xml:space="preserve"> По красоте — миллионы Камадев, в радовании всех людей — миллионы лун, в нежности — миллионы матерей, в сути щедрости — миллионы райских деревьев, в глубине — миллионы океанов, в сладости — миллионы нектаров, молока и мёда; на поприще расы любви он явил миллионы чудес. Да славится Бог Гаура!</w:t>
-      </w:r>
-    </w:p>
-    <w:p>
-      <w:pPr>
-        <w:spacing w:after="60"/>
-        <w:ind w:left="510" w:hanging="510"/>
-      </w:pPr>
-      <w:r>
-        <w:rPr>
-          <w:b/>
-          <w:i w:val="0"/>
-        </w:rPr>
-        <w:t>101.</w:t>
-      </w:r>
-      <w:r>
-        <w:t xml:space="preserve"> Пусть же славится Господь Гаура, чьё высшее дивное величие явлено открыто: в неистовстве великой любви он пляшет, словно безумный, неописуемо, так что даже Шиву, Брахму и других охватывает великое изумление</w:t>
-      </w:r>
-      <w:r>
-        <w:rPr>
-          <w:b w:val="0"/>
-          <w:i w:val="0"/>
-          <w:vertAlign w:val="superscript"/>
-        </w:rPr>
-        <w:t>1</w:t>
-      </w:r>
-      <w:r>
-        <w:t>.</w:t>
-      </w:r>
-    </w:p>
-    <w:p>
-      <w:pPr>
-        <w:spacing w:after="60"/>
-        <w:ind w:left="510" w:hanging="510"/>
-      </w:pPr>
-      <w:r>
-        <w:rPr>
-          <w:b/>
-          <w:i w:val="0"/>
-        </w:rPr>
-        <w:t>102.</w:t>
-      </w:r>
-      <w:r>
-        <w:t xml:space="preserve"> Его рёв — как рёв миллионов опьянённых царей зверей, сияние — как у миллионов солнц, прохлада — сильнее, чем у миллионов лун, походкой он превосходит миллионы обезумевших слонов; именем своим он искупает миллионы несчастных, он владыка миллионов Брахм и прочих, венец миллионов Адвайт</w:t>
-      </w:r>
-      <w:r>
-        <w:rPr>
-          <w:b w:val="0"/>
-          <w:i w:val="0"/>
-          <w:vertAlign w:val="superscript"/>
-        </w:rPr>
-        <w:t>2</w:t>
-      </w:r>
-      <w:r>
-        <w:t xml:space="preserve"> — славится Шри Шри Шачинандана!</w:t>
-      </w:r>
-    </w:p>
-    <w:p>
-      <w:pPr>
-        <w:spacing w:after="60"/>
-        <w:ind w:left="510" w:hanging="510"/>
-      </w:pPr>
-      <w:r>
-        <w:rPr>
-          <w:b/>
-          <w:i w:val="0"/>
-        </w:rPr>
-        <w:t>103.</w:t>
-      </w:r>
-      <w:r>
-        <w:t xml:space="preserve"> Путь, который далеко отстоит от пустоты, который неприступен, словно из-за мощных шипов, который не сбивает с толку ложными целями, который тотчас источает блаженство, полное расы, — этот путь он сразу озаряет, явив своё величие; полный нежности, он изгоняет тьму из пещеры сердца — славится этот неописуемый сияющий светильник Навадвипы</w:t>
-      </w:r>
-      <w:r>
-        <w:rPr>
-          <w:b w:val="0"/>
-          <w:i w:val="0"/>
-          <w:vertAlign w:val="superscript"/>
-        </w:rPr>
-        <w:t>3</w:t>
-      </w:r>
-      <w:r>
-        <w:t>.</w:t>
-      </w:r>
-    </w:p>
-    <w:p>
-      <w:pPr>
-        <w:spacing w:after="60"/>
-        <w:ind w:left="510" w:hanging="510"/>
-      </w:pPr>
-      <w:r>
-        <w:rPr>
-          <w:b/>
-          <w:i w:val="0"/>
-        </w:rPr>
-        <w:t>104.</w:t>
-      </w:r>
-      <w:r>
-        <w:t xml:space="preserve"> Издали сжигая мотыльков ложной логики, прохладный, как миллионы лун, обитель ростков света, высшая сладость, изгоняющий внешнюю и внутреннюю тьму; его божественный свет разливается от фитиля сердца, пропитанного маслом любви; сияющий золотом — по милости здесь ярко горит этот дивный светильник Навадвипы.</w:t>
-      </w:r>
-    </w:p>
-    <w:p>
-      <w:pPr>
-        <w:spacing w:after="60"/>
-        <w:ind w:left="510" w:hanging="510"/>
-      </w:pPr>
-      <w:r>
-        <w:rPr>
-          <w:b/>
-          <w:i w:val="0"/>
-        </w:rPr>
-        <w:t>105.</w:t>
-      </w:r>
-      <w:r>
-        <w:t xml:space="preserve"> Криками раскалывая и оглашая стороны света, волнами раскатистого смеха делая небо белым, словно от распустившихся жасминов и кувшинок, всем телом дрожа, как листья, трепещущие на ветру, опьянённый, с походкой, захлёстнутой хмелем расы любви, — сияет Гаура-Хари.</w:t>
-      </w:r>
-    </w:p>
-    <w:p>
-      <w:pPr>
-        <w:spacing w:after="60"/>
-        <w:ind w:left="510" w:hanging="510"/>
-      </w:pPr>
-      <w:r>
-        <w:rPr>
-          <w:b/>
-          <w:i w:val="0"/>
-        </w:rPr>
-        <w:t>106.</w:t>
-      </w:r>
-      <w:r>
-        <w:t xml:space="preserve"> Без изъяна (без ночи), прекрасно-круглый, свободный от пятен и кривизны, вечно изливающий нектар великой любви, что снимает три страдания всех без остатка живых существ; поднявшийся из молочного океана лона Шачи, прекрасного от восхода счастья; сладость его лучей вкушают птицы-чакоры — сердца преданных: сияет неописуемая луна Гауранга.</w:t>
-      </w:r>
-    </w:p>
-    <w:p>
-      <w:pPr>
-        <w:spacing w:after="60"/>
-        <w:ind w:left="510" w:hanging="510"/>
-      </w:pPr>
-      <w:r>
-        <w:rPr>
-          <w:b/>
-          <w:i w:val="0"/>
-        </w:rPr>
-        <w:t>107.</w:t>
-      </w:r>
-      <w:r>
-        <w:t xml:space="preserve"> Снова и снова орошая бледные щёки слезами глаз, раз за разом испуская — о! — долгие вздохи, громко рыдая, издавая жалобные-жалобные крики «Ха! Ха!», — сияет неописуемый Гаура, погружённый в чувство разлучённой девушки Враджа.</w:t>
-      </w:r>
-    </w:p>
-    <w:p>
-      <w:pPr>
-        <w:spacing w:after="60"/>
-        <w:ind w:left="510" w:hanging="510"/>
-      </w:pPr>
-      <w:r>
-        <w:rPr>
-          <w:b/>
-          <w:i w:val="0"/>
-        </w:rPr>
-        <w:t>108.</w:t>
-      </w:r>
-      <w:r>
-        <w:t xml:space="preserve"> Имея цвет, подобный неописуемой сути золота, очищенного в огне, приняв дивный облик гордого юного пастушка, порою являя те или иные дивные игры, — сияет Гауранга-Луна, сам — тело Радхи и Мадхурипу (Кришны).</w:t>
-      </w:r>
-    </w:p>
-    <w:p>
-      <w:pPr>
-        <w:pStyle w:val="Heading2"/>
-      </w:pPr>
-      <w:r>
-        <w:t>Величие воплощения (аватара-махима)</w:t>
-      </w:r>
-    </w:p>
-    <w:p>
-      <w:pPr>
-        <w:spacing w:after="60"/>
-        <w:ind w:left="510" w:hanging="510"/>
-      </w:pPr>
-      <w:r>
-        <w:rPr>
-          <w:b/>
-          <w:i w:val="0"/>
-        </w:rPr>
-        <w:t>109.</w:t>
-      </w:r>
-      <w:r>
-        <w:t xml:space="preserve"> Неожиданно приходит волна Имени Господа к воплощённым существам, окружённым даже тяжкими грехами; о! — даже сердца людей, подобные алмазу, стали как свежее масло, — когда он нисходит в мир. Этот Гаура — моё прибежище.</w:t>
-      </w:r>
-    </w:p>
-    <w:p>
-      <w:pPr>
-        <w:spacing w:after="60"/>
-        <w:ind w:left="510" w:hanging="510"/>
-      </w:pPr>
-      <w:r>
-        <w:rPr>
-          <w:b/>
-          <w:i w:val="0"/>
-        </w:rPr>
-        <w:t>110.</w:t>
-      </w:r>
-      <w:r>
-        <w:t xml:space="preserve"> Нет ни йоги, ни медитации, ни джапы, ни подвижничества, ни отречения, ни обетов, ни Вед, ни благочестия, — где уж там отказ от запретного! — и всё же, когда нисходит Чайтанья, чьё сердце — сама суть сострадания, люди здесь с радостью неожиданно похищают высший венец целей человека.</w:t>
-      </w:r>
-    </w:p>
-    <w:p>
-      <w:pPr>
-        <w:spacing w:after="60"/>
-        <w:ind w:left="510" w:hanging="510"/>
-      </w:pPr>
-      <w:r>
-        <w:rPr>
-          <w:b/>
-          <w:i w:val="0"/>
-        </w:rPr>
-        <w:t>111.</w:t>
-      </w:r>
-      <w:r>
-        <w:t xml:space="preserve"> Когда на земле нисходит Шри Чайтанья, дивный своим богатством, — ум, упавший в поток великой кармы, обретает устойчивость; ум, твёрдый больше великих камней, становится текучим; ум, лишённый всякой практики, пляшет выше умов великих йогов.</w:t>
-      </w:r>
-    </w:p>
-    <w:p>
-      <w:pPr>
-        <w:spacing w:after="60"/>
-        <w:ind w:left="510" w:hanging="510"/>
-      </w:pPr>
-      <w:r>
-        <w:rPr>
-          <w:b/>
-          <w:i w:val="0"/>
-        </w:rPr>
-        <w:t>112.</w:t>
-      </w:r>
-      <w:r>
-        <w:t xml:space="preserve"> Когда Чайтанья-Луна явил высший путь бхакти-йоги, мирские люди оставили разговоры о жене, сыновьях и прочем, учёные — споры о шастрах, владыки йогов — мучения обуздания дыхания, подвижники — подвижничество, санньясины — изучение знания. Никакой иной расы не осталось.</w:t>
-      </w:r>
-    </w:p>
-    <w:p>
-      <w:pPr>
-        <w:spacing w:after="60"/>
-        <w:ind w:left="510" w:hanging="510"/>
-      </w:pPr>
-      <w:r>
-        <w:rPr>
-          <w:b/>
-          <w:i w:val="0"/>
-        </w:rPr>
-        <w:t>113.</w:t>
-      </w:r>
-      <w:r>
-        <w:t xml:space="preserve"> Когда в мир нисходит Гаура, в каждом доме гремит санкиртана Хари, в каждом теле сияет обилие трепета и слёз, и в каждой привязанности — ступень высшего сладостного превосходства, далёкая даже от Вед.</w:t>
-      </w:r>
-    </w:p>
-    <w:p>
-      <w:pPr>
-        <w:spacing w:after="60"/>
-        <w:ind w:left="510" w:hanging="510"/>
-      </w:pPr>
-      <w:r>
-        <w:rPr>
-          <w:b/>
-          <w:i w:val="0"/>
-        </w:rPr>
-        <w:t>114.</w:t>
-      </w:r>
-      <w:r>
-        <w:t xml:space="preserve"> Неожиданно весь этот мир затопили неописуемые потоки расы из океана великой любви; неожиданно изумление охватило людей — от невиданных и неслыханных прежде преображений, — когда нисходит Кришна в теле, прекрасном золотым сиянием.</w:t>
-      </w:r>
-    </w:p>
-    <w:p>
-      <w:pPr>
-        <w:spacing w:after="60"/>
-        <w:ind w:left="510" w:hanging="510"/>
-      </w:pPr>
-      <w:r>
-        <w:rPr>
-          <w:b/>
-          <w:i w:val="0"/>
-        </w:rPr>
-        <w:t>115.</w:t>
-      </w:r>
-      <w:r>
-        <w:t xml:space="preserve"> Прежде одни, неудержимо возгордившись, хватались повсюду за все шастры; другие, мнящие себя счастливцами, держались обрядов, подвижничества и прочих правил; некоторые же, с превратным намерением, повторяли два-три имени Хари. А теперь, когда взошёл Гаурачандра, даже према стала обычной.</w:t>
-      </w:r>
-    </w:p>
-    <w:p>
-      <w:pPr>
-        <w:spacing w:after="60"/>
-        <w:ind w:left="510" w:hanging="510"/>
-      </w:pPr>
-      <w:r>
-        <w:rPr>
-          <w:b/>
-          <w:i w:val="0"/>
-        </w:rPr>
-        <w:t>116.</w:t>
-      </w:r>
-      <w:r>
-        <w:t xml:space="preserve"> Когда снизошёл Бог по имени Чайтанья, о служении лотосным стопам которого молят боги, — и простёр по вселенной сладчайшие волны нектара любви, — кто ребёнок, кто старик, кто тупица, кто женщина, кто ничтожество? У всех, кто предан стопам Хари, возникло неописуемое единство вкуса</w:t>
-      </w:r>
-      <w:r>
-        <w:rPr>
-          <w:b w:val="0"/>
-          <w:i w:val="0"/>
-          <w:vertAlign w:val="superscript"/>
-        </w:rPr>
-        <w:t>4</w:t>
-      </w:r>
-      <w:r>
-        <w:t>.</w:t>
-      </w:r>
-    </w:p>
-    <w:p>
-      <w:pPr>
-        <w:spacing w:after="60"/>
-        <w:ind w:left="510" w:hanging="510"/>
-      </w:pPr>
-      <w:r>
-        <w:rPr>
-          <w:b/>
-          <w:i w:val="0"/>
-        </w:rPr>
-        <w:t>117.</w:t>
-      </w:r>
-      <w:r>
-        <w:t xml:space="preserve"> Сюда пришли все — Шанкара, Нарада и другие; явилась сама Шри (Лакшми); соединился с ним и бог Халаюдха (Баларама); родились и те самые Вришни; более того — явились и жители Враджа: пастушки, гопи и другие, — когда на землю сошёл Шри Гаурачандра, владыка расы полной любви.</w:t>
-      </w:r>
-    </w:p>
-    <w:p>
-      <w:pPr>
-        <w:spacing w:after="60"/>
-        <w:ind w:left="510" w:hanging="510"/>
-      </w:pPr>
-      <w:r>
-        <w:rPr>
-          <w:b/>
-          <w:i w:val="0"/>
-        </w:rPr>
-        <w:t>118.</w:t>
-      </w:r>
-      <w:r>
-        <w:t xml:space="preserve"> Нежные слуги, наделённые сладчайшим, сияющим и щедрым [чувством], — все они нисошли рядом с его двумя лотосными стопами. Когда дивный золотой Гаура раздаёт миру собственную любовь, они обрели богатство нектара великой любви большее, чем прежде.</w:t>
-      </w:r>
-    </w:p>
-    <w:p>
-      <w:pPr>
-        <w:spacing w:after="60"/>
-        <w:ind w:left="510" w:hanging="510"/>
-      </w:pPr>
-      <w:r>
-        <w:rPr>
-          <w:b/>
-          <w:i w:val="0"/>
-        </w:rPr>
-        <w:t>119.</w:t>
-      </w:r>
-      <w:r>
-        <w:t xml:space="preserve"> Когда на землю сошёл Шри Чайтанья, суть дивного величия, — ах! — даже благородные жёны вокруг громко-громко смеются; даже сердца, сложенные из камней дурных чувственных привязанностей, становятся текучими; даже невежды посрамляют собрание знатоков всех шастр.</w:t>
-      </w:r>
-    </w:p>
-    <w:p>
-      <w:pPr>
-        <w:spacing w:after="60"/>
-        <w:ind w:left="510" w:hanging="510"/>
-      </w:pPr>
-      <w:r>
-        <w:rPr>
-          <w:b/>
-          <w:i w:val="0"/>
-        </w:rPr>
-        <w:t>120.</w:t>
-      </w:r>
-      <w:r>
-        <w:t xml:space="preserve"> Прежде даже у всезнающих почти не было разумения: их скудный, косный рассудок не ступал на суть всех целей. Но теперь, когда по милости в мир нисшёл Гаурачандра, — кто не вошёл в бхакти сладостной любви, в сияющую расу глубоких и щедрых чувств?</w:t>
-      </w:r>
-      <w:r>
-        <w:rPr>
-          <w:b w:val="0"/>
-          <w:i w:val="0"/>
-          <w:vertAlign w:val="superscript"/>
-        </w:rPr>
-        <w:t>5</w:t>
-      </w:r>
-    </w:p>
-    <w:p>
-      <w:pPr>
-        <w:spacing w:after="60"/>
-        <w:ind w:left="510" w:hanging="510"/>
-      </w:pPr>
-      <w:r>
-        <w:rPr>
-          <w:b/>
-          <w:i w:val="0"/>
-        </w:rPr>
-        <w:t>121.</w:t>
-      </w:r>
-      <w:r>
-        <w:t xml:space="preserve"> Высший смысл «Шримад-Бхагаватам», который Шри Вайясаки (Шука) запечатлел даже в рассказе о раса — так, что трудно уловить связь; то, что есть единственное истинное вместилище вкуса расы галантного героя игр любви Радхи, — чтобы распространить это сокровище, Хари нисшёл в мир в облике Гауры.</w:t>
-      </w:r>
-    </w:p>
-    <w:p>
-      <w:pPr>
-        <w:spacing w:after="60"/>
-        <w:ind w:left="510" w:hanging="510"/>
-      </w:pPr>
-      <w:r>
-        <w:rPr>
-          <w:b/>
-          <w:i w:val="0"/>
-        </w:rPr>
-        <w:t>122.</w:t>
-      </w:r>
-      <w:r>
-        <w:t xml:space="preserve"> …одни обрели достойное хвалы […]; некоторые — Уддхава и другие — обрели служение; […] другие — положение Шридамы и прочих друзей; иные обрели чувство лотосооких девушек Враджа; а иные, счастливейшие и мудрые, пьют [нектар] лотосных стоп Радхи. Каких только богатств не досталось миру по милости Шри Чайтаньи Махапрабху!</w:t>
-      </w:r>
-      <w:r>
-        <w:rPr>
-          <w:b w:val="0"/>
-          <w:i w:val="0"/>
-          <w:vertAlign w:val="superscript"/>
-        </w:rPr>
-        <w:t>6</w:t>
-      </w:r>
-    </w:p>
-    <w:p>
-      <w:pPr>
-        <w:spacing w:after="60"/>
-        <w:ind w:left="510" w:hanging="510"/>
-      </w:pPr>
-      <w:r>
-        <w:rPr>
-          <w:b/>
-          <w:i w:val="0"/>
-        </w:rPr>
-        <w:t>123.</w:t>
-      </w:r>
-      <w:r>
-        <w:t xml:space="preserve"> Прежде всезнающие лучшие мудрецы доводами распространили каждый своё учение, и ни один человек не был твёрдо уверен ни в одном из них. А теперь, когда снова взошёл Гауранга-Луна несравненной силы, — кто не убедится, что смысл шрути — лишь преданность Хари?</w:t>
-      </w:r>
-    </w:p>
-    <w:p>
-      <w:pPr>
-        <w:spacing w:after="60"/>
-        <w:ind w:left="510" w:hanging="510"/>
-      </w:pPr>
-      <w:r>
-        <w:rPr>
-          <w:b/>
-          <w:i w:val="0"/>
-        </w:rPr>
-        <w:t>124.</w:t>
-      </w:r>
-      <w:r>
-        <w:t xml:space="preserve"> Я вспоминаю некое дивное проявление блеска лун-самоцветов на ногтях Гауранги-Луны, которое погружает весь мир в единственный океан нектарной расы великой любви святых.</w:t>
-      </w:r>
-    </w:p>
-    <w:p>
-      <w:pPr>
-        <w:spacing w:after="60"/>
-        <w:ind w:left="510" w:hanging="510"/>
-      </w:pPr>
-      <w:r>
-        <w:rPr>
-          <w:b/>
-          <w:i w:val="0"/>
-        </w:rPr>
-        <w:t>125.</w:t>
-      </w:r>
-      <w:r>
-        <w:t xml:space="preserve"> Некоторые из прежних [воплощений] своими великими заслугами и благими делами приводили к цели одного-другого. Но так, чтобы весь мир был погружён в океан любви, — не делал никто.</w:t>
-      </w:r>
-    </w:p>
-    <w:p>
-      <w:pPr>
-        <w:spacing w:after="60"/>
-        <w:ind w:left="510" w:hanging="510"/>
-      </w:pPr>
-      <w:r>
-        <w:rPr>
-          <w:b/>
-          <w:i w:val="0"/>
-        </w:rPr>
-        <w:t>126.</w:t>
-      </w:r>
-      <w:r>
-        <w:t xml:space="preserve"> Даже имеющий несравненную верность дхарме и величайшую преданность Вишну, бывает, хранит здесь в сердце словно бы камень; а тот, кто ниже убийцы коровы, — о! — затопляет мир потоками слёз. Ах, кто постигнет глубокую игру золотого Гауранги?</w:t>
-      </w:r>
-    </w:p>
-    <w:p>
-      <w:pPr>
-        <w:spacing w:after="60"/>
-        <w:ind w:left="510" w:hanging="510"/>
-      </w:pPr>
-      <w:r>
-        <w:rPr>
-          <w:b/>
-          <w:i w:val="0"/>
-        </w:rPr>
-        <w:t>127.</w:t>
-      </w:r>
-      <w:r>
-        <w:t xml:space="preserve"> Порою, охваченный Кришной, он пляшет, изображая множество поз; порою, охваченный Радхой, с плачем в муке восклицает: «Хари! Хари! Хари!»; порою ползает, как младенец; порою ведёт себя как пастушок. Так глубоко великий Гаура изумляет мир.</w:t>
-      </w:r>
-    </w:p>
-    <w:p>
-      <w:pPr>
-        <w:spacing w:after="60"/>
-        <w:ind w:left="510" w:hanging="510"/>
-      </w:pPr>
-      <w:r>
-        <w:rPr>
-          <w:b/>
-          <w:i w:val="0"/>
-        </w:rPr>
-        <w:t>128.</w:t>
-      </w:r>
-      <w:r>
-        <w:t xml:space="preserve"> На берегу солёного океана, в играх, где вспыхивает суть сладости, прежде не бывалой; погружая мир в [чувства] сокровищницы расы юных пастушек; даже в детских забавах [озаряя] вселенную своим сиянием, — мне мил неописуемый облик, словно сотканный из расплавленного золота</w:t>
-      </w:r>
-      <w:r>
-        <w:rPr>
-          <w:b w:val="0"/>
-          <w:i w:val="0"/>
-          <w:vertAlign w:val="superscript"/>
-        </w:rPr>
-        <w:t>7</w:t>
-      </w:r>
-      <w:r>
-        <w:t>.</w:t>
-      </w:r>
-    </w:p>
-    <w:p>
-      <w:pPr>
-        <w:spacing w:after="60"/>
-        <w:ind w:left="510" w:hanging="510"/>
-      </w:pPr>
-      <w:r>
-        <w:rPr>
-          <w:b/>
-          <w:i w:val="0"/>
-        </w:rPr>
-        <w:t>129.</w:t>
-      </w:r>
-      <w:r>
-        <w:t xml:space="preserve"> Кто прежде слышал о дивном предмете, называемом према? Кто знал величие Имён? Кто входил в великую сладость лесов Вриндаваны? Кто знал Радху — предел сладости и чуда высшей расы? Один лишь Чайтанья-Луна по высшей милости открыл всё это.</w:t>
-      </w:r>
-    </w:p>
-    <w:p>
-      <w:pPr>
-        <w:pStyle w:val="Heading2"/>
-      </w:pPr>
-      <w:r>
-        <w:t>Красота и танец Гауры</w:t>
-      </w:r>
-    </w:p>
-    <w:p>
-      <w:pPr>
-        <w:spacing w:after="60"/>
-        <w:ind w:left="510" w:hanging="510"/>
-      </w:pPr>
-      <w:r>
-        <w:rPr>
-          <w:b/>
-          <w:i w:val="0"/>
-        </w:rPr>
-        <w:t>130.</w:t>
-      </w:r>
-      <w:r>
-        <w:t xml:space="preserve"> Он покрывает вселенную миллионами отсветов золотого сияния тела, колышущегося на волнах океана нектара расы полной любви; ему воздают хвалу Владыка (Шива), Творец (Брахма), Вьяса и другие; явив пленяющий мир облик, едва различимый миллионами шрути, — о чудо! — на берегу солёного океана пляшет сам Высший Брахман.</w:t>
-      </w:r>
-    </w:p>
-    <w:p>
-      <w:pPr>
-        <w:spacing w:after="60"/>
-        <w:ind w:left="510" w:hanging="510"/>
-      </w:pPr>
-      <w:r>
-        <w:rPr>
-          <w:b/>
-          <w:i w:val="0"/>
-        </w:rPr>
-        <w:t>131.</w:t>
-      </w:r>
-      <w:r>
-        <w:t xml:space="preserve"> Кто этот лучший из галантных героев — Гаура? Его бёдра украшены шёлковой тканью, на руке браслет, на груди ожерелье, в ушах серьги, на ногах ножные колокольчики; он поднял и связал пышные кудри, увенчав их гирляндой из распустившегося жасмина, — он играет, танцуя под свои же имена.</w:t>
-      </w:r>
-    </w:p>
-    <w:p>
-      <w:pPr>
-        <w:spacing w:after="60"/>
-        <w:ind w:left="510" w:hanging="510"/>
-      </w:pPr>
-      <w:r>
-        <w:rPr>
-          <w:b/>
-          <w:i w:val="0"/>
-        </w:rPr>
-        <w:t>132.</w:t>
-      </w:r>
-      <w:r>
-        <w:t xml:space="preserve"> Когда Шри Гаурачандра, обезумевший от собственной любви, исполнял на земле неистовый танец, боги били в литавры, лучшие из гандхарвов пели, сиддхи непрерывным дождём цветов покрыли эту землю, а сонмы великих риши с любовью предстали, вознося дивные хвалы.</w:t>
-      </w:r>
-    </w:p>
-    <w:p>
-      <w:pPr>
-        <w:spacing w:after="60"/>
-        <w:ind w:left="510" w:hanging="510"/>
-      </w:pPr>
-      <w:r>
-        <w:rPr>
-          <w:b/>
-          <w:i w:val="0"/>
-        </w:rPr>
-        <w:t>133.</w:t>
-      </w:r>
-      <w:r>
-        <w:t xml:space="preserve"> Он то смеётся, то плачет, то лишается чувств, то катается по земле, то бежит, то пляшет, то вздыхает, то издаёт громкие крики «Ха! Ха!» — опьянённый хмелем великой любви, здесь играет Гаура-Хари.</w:t>
-      </w:r>
-    </w:p>
-    <w:p>
-      <w:pPr>
-        <w:spacing w:after="60"/>
-        <w:ind w:left="510" w:hanging="510"/>
-      </w:pPr>
-      <w:r>
-        <w:rPr>
-          <w:b/>
-          <w:i w:val="0"/>
-        </w:rPr>
-        <w:t>134.</w:t>
-      </w:r>
-      <w:r>
-        <w:t xml:space="preserve"> Неописуемыми потоками слёз делая землю перед собой грязью, подперев ладонью бледную щёку, живя — о чудо! — на берегу солёного океана, нося одежду алого цвета, — сам Хари, став золотым, распространяет любовь к лотосным стопам Радхи.</w:t>
-      </w:r>
-    </w:p>
-    <w:p>
-      <w:pPr>
-        <w:spacing w:after="60"/>
-        <w:ind w:left="510" w:hanging="510"/>
-      </w:pPr>
-      <w:r>
-        <w:rPr>
-          <w:b/>
-          <w:i w:val="0"/>
-        </w:rPr>
-        <w:t>135.</w:t>
-      </w:r>
-      <w:r>
-        <w:t xml:space="preserve"> Топотом ног оглашая стороны света, каплями слёз превращая землю в грязь, — о! — громовым смехом сотрясая небо, [золотистый, с алым одеянием, колышущимся на прекрасных бёдрах,] — что за Бог радостно пляшет в цветущем саду на берегу солёного океана?</w:t>
-      </w:r>
-      <w:r>
-        <w:rPr>
-          <w:b w:val="0"/>
-          <w:i w:val="0"/>
-          <w:vertAlign w:val="superscript"/>
-        </w:rPr>
-        <w:t>8</w:t>
-      </w:r>
-    </w:p>
-    <w:p>
-      <w:pPr>
-        <w:pStyle w:val="Heading2"/>
-      </w:pPr>
-      <w:r>
-        <w:t>Скорбь (шочака)</w:t>
-      </w:r>
-    </w:p>
-    <w:p>
-      <w:pPr>
-        <w:spacing w:after="60"/>
-        <w:ind w:left="510" w:hanging="510"/>
-      </w:pPr>
-      <w:r>
-        <w:rPr>
-          <w:b/>
-          <w:i w:val="0"/>
-        </w:rPr>
-        <w:t>136.</w:t>
-      </w:r>
-      <w:r>
-        <w:t xml:space="preserve"> Его природу не могут разглядеть даже венцы всех Вед; неописуемо прекрасен его сладчайший путь, недоступный даже Шиве, Брахме и другим; он внезапно опьянил этот мир вином Хари-расы, — разве этот Шри Чайтанья-Луна доступен моим словам или уму?</w:t>
-      </w:r>
-    </w:p>
-    <w:p>
-      <w:pPr>
-        <w:spacing w:after="60"/>
-        <w:ind w:left="510" w:hanging="510"/>
-      </w:pPr>
-      <w:r>
-        <w:rPr>
-          <w:b/>
-          <w:i w:val="0"/>
-        </w:rPr>
-        <w:t>137.</w:t>
-      </w:r>
-      <w:r>
-        <w:t xml:space="preserve"> Где-то — косность в обрядах, где-то — джапа, подвижничество, йога и прочее, где-то — искажённое поклонение Говинде, где-то — гордость знанием; а святая бхакти Хари, хоть и сияющая, где-то осталась лишь на словах. Ах, Чайтанья, куда ты ушёл? Твоего пути нигде не видно!</w:t>
-      </w:r>
-    </w:p>
-    <w:p>
-      <w:pPr>
-        <w:spacing w:after="60"/>
-        <w:ind w:left="510" w:hanging="510"/>
-      </w:pPr>
-      <w:r>
-        <w:rPr>
-          <w:b/>
-          <w:i w:val="0"/>
-        </w:rPr>
-        <w:t>138.</w:t>
-      </w:r>
-      <w:r>
-        <w:t xml:space="preserve"> Когда явился Хари, золотой, как расплавленное золото, его же величием мир погрузился в расу любви, и повсюду громко-громко гремела санкиртана Хари, — ах, вернётся ли когда-нибудь то сладкое время?</w:t>
-      </w:r>
-    </w:p>
-    <w:p>
-      <w:pPr>
-        <w:spacing w:after="60"/>
-        <w:ind w:left="510" w:hanging="510"/>
-      </w:pPr>
-      <w:r>
-        <w:rPr>
-          <w:b/>
-          <w:i w:val="0"/>
-        </w:rPr>
-        <w:t>139.</w:t>
-      </w:r>
-      <w:r>
-        <w:t xml:space="preserve"> Та же это благословенная столица Гауды, тот же берег океана, тот же Шри Пурушоттама (Джаганнатха), те же имена Мадхупати, — но, Хари, Хари! — такого праздника любви нигде не видно. Ах, Чайтанья, сокровищница милости, увижу ли я снова твоё величие?</w:t>
-      </w:r>
-    </w:p>
-    <w:p>
-      <w:pPr>
-        <w:spacing w:after="60"/>
-        <w:ind w:left="510" w:hanging="510"/>
-      </w:pPr>
-      <w:r>
-        <w:rPr>
-          <w:b/>
-          <w:i w:val="0"/>
-        </w:rPr>
-        <w:t>140.</w:t>
-      </w:r>
-      <w:r>
-        <w:t xml:space="preserve"> Даже если о Гаурачандре сказать, что он — частичное воплощение, как Рыба и прочие, — всё равно он не просто проявление какой-то силы и игры. Своими дивными играми, явленными несравненной полнотой всех сил, он, чьё величие непостижимо, нисшёл полным [Богом].</w:t>
-      </w:r>
-    </w:p>
-    <w:p>
-      <w:pPr>
-        <w:spacing w:after="60"/>
-        <w:ind w:left="510" w:hanging="510"/>
-      </w:pPr>
-      <w:r>
-        <w:rPr>
-          <w:b/>
-          <w:i w:val="0"/>
-        </w:rPr>
-        <w:t>141.</w:t>
-      </w:r>
-      <w:r>
-        <w:t xml:space="preserve"> Пусть Махапрабху обладает дивным величием, превосходящим Брахму, Шиву и прочих, — услышав лепет несмышлёного ребёнка, он непременно будет ласков.</w:t>
-      </w:r>
-    </w:p>
-    <w:p>
-      <w:pPr>
-        <w:spacing w:after="60"/>
-        <w:ind w:left="510" w:hanging="510"/>
-      </w:pPr>
-      <w:r>
-        <w:rPr>
-          <w:b/>
-          <w:i w:val="0"/>
-        </w:rPr>
-        <w:t>142.</w:t>
-      </w:r>
-      <w:r>
-        <w:t xml:space="preserve"> Я не видел шастр, не видел гуру, мудрые разумом не разбирали [моих слов], — пусть же, как бы я ни лепетал по-детски, Гаура-Хари будет милостив ко мне.</w:t>
-      </w:r>
-    </w:p>
-    <w:p>
-      <w:pPr>
-        <w:spacing w:after="60"/>
-        <w:jc w:val="both"/>
-      </w:pPr>
-      <w:r>
-        <w:rPr>
-          <w:b w:val="0"/>
-          <w:i/>
-        </w:rPr>
-        <w:t>Так заканчивается книга «Шри Чайтанья-чандрамрита» в двенадцати разделах, сложенная досточтимым Шрипадой Госвами Прабодханандой Сарасвати.</w:t>
-      </w:r>
-    </w:p>
-    <w:p>
-      <w:pPr>
-        <w:spacing w:after="60"/>
-        <w:ind w:left="283"/>
-      </w:pPr>
-      <w:r>
-        <w:rPr>
-          <w:b/>
-          <w:i w:val="0"/>
-          <w:sz w:val="18"/>
-        </w:rPr>
-        <w:t>1.</w:t>
-      </w:r>
-      <w:r>
-        <w:rPr>
-          <w:sz w:val="18"/>
-        </w:rPr>
-        <w:t xml:space="preserve"> Одна строка этой шлоки в издании 1951 г. не распознана; перевод передаёт смысл сохранившихся строк.</w:t>
-      </w:r>
-    </w:p>
-    <w:p>
-      <w:pPr>
-        <w:spacing w:after="60"/>
-        <w:ind w:left="283"/>
-      </w:pPr>
-      <w:r>
-        <w:rPr>
-          <w:b/>
-          <w:i w:val="0"/>
-          <w:sz w:val="18"/>
-        </w:rPr>
-        <w:t>2.</w:t>
-      </w:r>
-      <w:r>
-        <w:rPr>
-          <w:sz w:val="18"/>
-        </w:rPr>
-        <w:t xml:space="preserve"> «Адвайта» здесь — знатоки недвойственности (адвайта-веданты); Гаура — «венец миллионов адвайтистов». Возможно и прочтение «венец миллионов Адвайт», то есть превосходящий самого Адвайту Ачарью.</w:t>
-      </w:r>
-    </w:p>
-    <w:p>
-      <w:pPr>
-        <w:spacing w:after="60"/>
-        <w:ind w:left="283"/>
-      </w:pPr>
-      <w:r>
-        <w:rPr>
-          <w:b/>
-          <w:i w:val="0"/>
-          <w:sz w:val="18"/>
-        </w:rPr>
-        <w:t>3.</w:t>
-      </w:r>
-      <w:r>
-        <w:rPr>
-          <w:sz w:val="18"/>
-        </w:rPr>
-        <w:t xml:space="preserve"> Первые две строки шлоки распознаны плохо; перевод приблизителен.</w:t>
-      </w:r>
-    </w:p>
-    <w:p>
-      <w:pPr>
-        <w:spacing w:after="60"/>
-        <w:ind w:left="283"/>
-      </w:pPr>
-      <w:r>
-        <w:rPr>
-          <w:b/>
-          <w:i w:val="0"/>
-          <w:sz w:val="18"/>
-        </w:rPr>
-        <w:t>4.</w:t>
-      </w:r>
-      <w:r>
-        <w:rPr>
-          <w:sz w:val="18"/>
-        </w:rPr>
-        <w:t xml:space="preserve"> Вторая строка распознана неполностью; смысл восстановлен по контексту.</w:t>
-      </w:r>
-    </w:p>
-    <w:p>
-      <w:pPr>
-        <w:spacing w:after="60"/>
-        <w:ind w:left="283"/>
-      </w:pPr>
-      <w:r>
-        <w:rPr>
-          <w:b/>
-          <w:i w:val="0"/>
-          <w:sz w:val="18"/>
-        </w:rPr>
-        <w:t>5.</w:t>
-      </w:r>
-      <w:r>
-        <w:rPr>
-          <w:sz w:val="18"/>
-        </w:rPr>
-        <w:t xml:space="preserve"> Вторая строка шлоки в обоих изданиях распознана лишь частично; перевод восстановлен по сохранившимся словам и бенгальскому толкованию.</w:t>
-      </w:r>
-    </w:p>
-    <w:p>
-      <w:pPr>
-        <w:spacing w:after="60"/>
-        <w:ind w:left="283"/>
-      </w:pPr>
-      <w:r>
-        <w:rPr>
-          <w:b/>
-          <w:i w:val="0"/>
-          <w:sz w:val="18"/>
-        </w:rPr>
-        <w:t>6.</w:t>
-      </w:r>
-      <w:r>
-        <w:rPr>
-          <w:sz w:val="18"/>
-        </w:rPr>
-        <w:t xml:space="preserve"> Первые полторы строки шлоки не распознаны; квадратными скобками отмечены пропуски.</w:t>
-      </w:r>
-    </w:p>
-    <w:p>
-      <w:pPr>
-        <w:spacing w:after="60"/>
-        <w:ind w:left="283"/>
-      </w:pPr>
-      <w:r>
-        <w:rPr>
-          <w:b/>
-          <w:i w:val="0"/>
-          <w:sz w:val="18"/>
-        </w:rPr>
-        <w:t>7.</w:t>
-      </w:r>
-      <w:r>
-        <w:rPr>
-          <w:sz w:val="18"/>
-        </w:rPr>
-        <w:t xml:space="preserve"> Шлока распознана неполностью; перевод приблизителен.</w:t>
-      </w:r>
-    </w:p>
-    <w:p>
-      <w:pPr>
-        <w:spacing w:after="60"/>
-        <w:ind w:left="283"/>
-      </w:pPr>
-      <w:r>
-        <w:rPr>
-          <w:b/>
-          <w:i w:val="0"/>
-          <w:sz w:val="18"/>
-        </w:rPr>
-        <w:t>8.</w:t>
-      </w:r>
-      <w:r>
-        <w:rPr>
-          <w:sz w:val="18"/>
-        </w:rPr>
-        <w:t xml:space="preserve"> Третья строка восстановлена по бенгальскому изданию лишь частично.</w:t>
+        <w:t xml:space="preserve"> «Адвайтисты» — знатоки недвойственности (адвайта-веданты); так толкует это слово и Бхактисиддханта.</w:t>
       </w:r>
     </w:p>
     <w:sectPr>

</xml_diff>